<commit_message>
VC word file changed added experiment 2
</commit_message>
<xml_diff>
--- a/Sem2/Vc/Cycle1-co1.docx
+++ b/Sem2/Vc/Cycle1-co1.docx
@@ -63,61 +63,49 @@
         <w:jc w:val="both"/>
         <w:rPr>
           <w:rFonts w:ascii="Times New Roman" w:hAnsi="Times New Roman" w:cs="Times New Roman"/>
-          <w:b/>
-          <w:bCs/>
-          <w:sz w:val="24"/>
-          <w:szCs w:val="24"/>
-        </w:rPr>
-      </w:pPr>
-      <w:r>
-        <w:rPr>
-          <w:rFonts w:ascii="Times New Roman" w:hAnsi="Times New Roman" w:cs="Times New Roman"/>
-          <w:b/>
-          <w:bCs/>
-          <w:sz w:val="24"/>
-          <w:szCs w:val="24"/>
-        </w:rPr>
-        <w:t>Q: Familiarization</w:t>
-      </w:r>
-      <w:r>
-        <w:rPr>
-          <w:rFonts w:ascii="Times New Roman" w:hAnsi="Times New Roman" w:cs="Times New Roman"/>
-          <w:b/>
-          <w:bCs/>
-          <w:sz w:val="24"/>
-          <w:szCs w:val="24"/>
-        </w:rPr>
-        <w:t xml:space="preserve"> to computer hardware such as CPU, Memory, Motherboard </w:t>
-      </w:r>
-      <w:r>
-        <w:rPr>
-          <w:rFonts w:ascii="Times New Roman" w:hAnsi="Times New Roman" w:cs="Times New Roman"/>
-          <w:b/>
-          <w:bCs/>
-          <w:sz w:val="24"/>
-          <w:szCs w:val="24"/>
-        </w:rPr>
-        <w:t>etc.</w:t>
-      </w:r>
-    </w:p>
-    <w:p>
-      <w:pPr>
-        <w:jc w:val="both"/>
-        <w:rPr>
-          <w:rFonts w:ascii="Times New Roman" w:hAnsi="Times New Roman" w:cs="Times New Roman"/>
-          <w:sz w:val="24"/>
-          <w:szCs w:val="24"/>
-        </w:rPr>
-      </w:pPr>
-      <w:r>
-        <w:rPr>
-          <w:rFonts w:ascii="Times New Roman" w:hAnsi="Times New Roman" w:cs="Times New Roman"/>
-          <w:b/>
-          <w:bCs/>
-          <w:sz w:val="24"/>
-          <w:szCs w:val="24"/>
-        </w:rPr>
-        <w:t>Aim:</w:t>
+          <w:bCs/>
+          <w:sz w:val="28"/>
+          <w:szCs w:val="24"/>
+        </w:rPr>
+      </w:pPr>
+      <w:r>
+        <w:rPr>
+          <w:rFonts w:ascii="Times New Roman" w:hAnsi="Times New Roman" w:cs="Times New Roman"/>
+          <w:bCs/>
+          <w:sz w:val="28"/>
+          <w:szCs w:val="24"/>
+        </w:rPr>
+        <w:t>Q: Familiarization to computer hardware such as CPU, Memory, Motherboard etc.</w:t>
+      </w:r>
+    </w:p>
+    <w:p>
+      <w:pPr>
+        <w:jc w:val="both"/>
+        <w:rPr>
+          <w:rFonts w:ascii="Times New Roman" w:hAnsi="Times New Roman" w:cs="Times New Roman"/>
+          <w:sz w:val="24"/>
+          <w:szCs w:val="24"/>
+        </w:rPr>
+      </w:pPr>
+      <w:r>
+        <w:rPr>
+          <w:rFonts w:ascii="Times New Roman" w:hAnsi="Times New Roman" w:cs="Times New Roman"/>
+          <w:b/>
+          <w:bCs/>
+          <w:sz w:val="28"/>
+          <w:szCs w:val="24"/>
+        </w:rPr>
+        <w:t>AIM</w:t>
+      </w:r>
+      <w:r>
+        <w:rPr>
+          <w:rFonts w:ascii="Times New Roman" w:hAnsi="Times New Roman" w:cs="Times New Roman"/>
+          <w:b/>
+          <w:bCs/>
+          <w:sz w:val="24"/>
+          <w:szCs w:val="24"/>
+        </w:rPr>
+        <w:t>:</w:t>
       </w:r>
       <w:r>
         <w:rPr>
@@ -156,7 +144,7 @@
           <w:u w:val="single"/>
         </w:rPr>
         <w:drawing>
-          <wp:anchor distT="0" distB="0" distL="114300" distR="114300" simplePos="0" relativeHeight="251659264" behindDoc="0" locked="0" layoutInCell="1" allowOverlap="1" wp14:anchorId="687C94E5" wp14:editId="026CE9A4">
+          <wp:anchor distT="0" distB="0" distL="114300" distR="114300" simplePos="0" relativeHeight="251659264" behindDoc="0" locked="0" layoutInCell="1" allowOverlap="1" wp14:anchorId="687C94E5" wp14:editId="60146014">
             <wp:simplePos x="0" y="0"/>
             <wp:positionH relativeFrom="column">
               <wp:posOffset>2571750</wp:posOffset>
@@ -604,6 +592,7 @@
           <w:sz w:val="24"/>
           <w:szCs w:val="24"/>
         </w:rPr>
+        <w:lastRenderedPageBreak/>
         <w:t>Ram is the temporary memory used to store data while programs are running. It increases</w:t>
       </w:r>
       <w:r>
@@ -650,7 +639,6 @@
           <w:szCs w:val="24"/>
           <w:u w:val="single"/>
         </w:rPr>
-        <w:lastRenderedPageBreak/>
         <w:drawing>
           <wp:anchor distT="0" distB="0" distL="114300" distR="114300" simplePos="0" relativeHeight="251661312" behindDoc="0" locked="0" layoutInCell="1" allowOverlap="1" wp14:anchorId="6CB41765" wp14:editId="512FE1B2">
             <wp:simplePos x="0" y="0"/>
@@ -1221,7 +1209,6 @@
           <w:szCs w:val="24"/>
           <w:u w:val="single"/>
         </w:rPr>
-        <w:lastRenderedPageBreak/>
         <w:drawing>
           <wp:anchor distT="0" distB="0" distL="114300" distR="114300" simplePos="0" relativeHeight="251667456" behindDoc="0" locked="0" layoutInCell="1" allowOverlap="1" wp14:anchorId="6DFC4022" wp14:editId="1CD3C8B4">
             <wp:simplePos x="0" y="0"/>
@@ -1568,6 +1555,2242 @@
         </w:rPr>
       </w:pPr>
     </w:p>
+    <w:p>
+      <w:pPr>
+        <w:jc w:val="both"/>
+        <w:rPr>
+          <w:rFonts w:ascii="Times New Roman" w:hAnsi="Times New Roman" w:cs="Times New Roman"/>
+          <w:sz w:val="28"/>
+          <w:szCs w:val="28"/>
+        </w:rPr>
+      </w:pPr>
+    </w:p>
+    <w:p>
+      <w:pPr>
+        <w:jc w:val="both"/>
+        <w:rPr>
+          <w:rFonts w:ascii="Times New Roman" w:hAnsi="Times New Roman" w:cs="Times New Roman"/>
+          <w:sz w:val="28"/>
+          <w:szCs w:val="28"/>
+        </w:rPr>
+      </w:pPr>
+    </w:p>
+    <w:p>
+      <w:pPr>
+        <w:jc w:val="both"/>
+        <w:rPr>
+          <w:rFonts w:ascii="Times New Roman" w:hAnsi="Times New Roman" w:cs="Times New Roman"/>
+          <w:sz w:val="28"/>
+          <w:szCs w:val="28"/>
+        </w:rPr>
+      </w:pPr>
+    </w:p>
+    <w:p>
+      <w:pPr>
+        <w:jc w:val="both"/>
+        <w:rPr>
+          <w:rFonts w:ascii="Times New Roman" w:hAnsi="Times New Roman" w:cs="Times New Roman"/>
+          <w:sz w:val="28"/>
+          <w:szCs w:val="28"/>
+        </w:rPr>
+      </w:pPr>
+    </w:p>
+    <w:p>
+      <w:pPr>
+        <w:jc w:val="both"/>
+        <w:rPr>
+          <w:rFonts w:ascii="Times New Roman" w:hAnsi="Times New Roman" w:cs="Times New Roman"/>
+          <w:sz w:val="28"/>
+          <w:szCs w:val="28"/>
+        </w:rPr>
+      </w:pPr>
+    </w:p>
+    <w:p>
+      <w:pPr>
+        <w:jc w:val="both"/>
+        <w:rPr>
+          <w:rFonts w:ascii="Times New Roman" w:hAnsi="Times New Roman" w:cs="Times New Roman"/>
+          <w:sz w:val="28"/>
+          <w:szCs w:val="28"/>
+        </w:rPr>
+      </w:pPr>
+    </w:p>
+    <w:p>
+      <w:pPr>
+        <w:jc w:val="both"/>
+        <w:rPr>
+          <w:rFonts w:ascii="Times New Roman" w:hAnsi="Times New Roman" w:cs="Times New Roman"/>
+          <w:sz w:val="28"/>
+          <w:szCs w:val="28"/>
+        </w:rPr>
+      </w:pPr>
+    </w:p>
+    <w:p>
+      <w:pPr>
+        <w:pStyle w:val="Heading1"/>
+        <w:jc w:val="center"/>
+        <w:rPr>
+          <w:sz w:val="56"/>
+          <w:szCs w:val="56"/>
+        </w:rPr>
+      </w:pPr>
+      <w:r>
+        <w:rPr>
+          <w:sz w:val="56"/>
+          <w:szCs w:val="56"/>
+        </w:rPr>
+        <w:lastRenderedPageBreak/>
+        <w:t>Cycle-2</w:t>
+      </w:r>
+    </w:p>
+    <w:p>
+      <w:pPr>
+        <w:jc w:val="both"/>
+        <w:rPr>
+          <w:b/>
+          <w:bCs/>
+          <w:sz w:val="24"/>
+          <w:szCs w:val="24"/>
+          <w:u w:val="single"/>
+        </w:rPr>
+      </w:pPr>
+    </w:p>
+    <w:p>
+      <w:pPr>
+        <w:pStyle w:val="Heading1"/>
+        <w:jc w:val="both"/>
+        <w:rPr>
+          <w:b/>
+          <w:bCs/>
+          <w:u w:val="single"/>
+        </w:rPr>
+      </w:pPr>
+      <w:r>
+        <w:rPr>
+          <w:b/>
+          <w:bCs/>
+          <w:u w:val="single"/>
+        </w:rPr>
+        <w:t>Experiment-2</w:t>
+      </w:r>
+    </w:p>
+    <w:p>
+      <w:pPr>
+        <w:jc w:val="both"/>
+        <w:rPr>
+          <w:rFonts w:ascii="Times New Roman" w:hAnsi="Times New Roman" w:cs="Times New Roman"/>
+          <w:bCs/>
+          <w:sz w:val="28"/>
+          <w:szCs w:val="24"/>
+        </w:rPr>
+      </w:pPr>
+      <w:r>
+        <w:rPr>
+          <w:rFonts w:ascii="Times New Roman" w:hAnsi="Times New Roman" w:cs="Times New Roman"/>
+          <w:bCs/>
+          <w:sz w:val="28"/>
+          <w:szCs w:val="24"/>
+        </w:rPr>
+        <w:t>Q: Study hardware specification of AI powered computers (2025)</w:t>
+      </w:r>
+    </w:p>
+    <w:p>
+      <w:pPr>
+        <w:jc w:val="both"/>
+        <w:rPr>
+          <w:rFonts w:ascii="Times New Roman" w:hAnsi="Times New Roman" w:cs="Times New Roman"/>
+          <w:bCs/>
+          <w:sz w:val="24"/>
+          <w:szCs w:val="24"/>
+        </w:rPr>
+      </w:pPr>
+      <w:r>
+        <w:rPr>
+          <w:rFonts w:ascii="Times New Roman" w:hAnsi="Times New Roman" w:cs="Times New Roman"/>
+          <w:b/>
+          <w:bCs/>
+          <w:sz w:val="28"/>
+          <w:szCs w:val="24"/>
+        </w:rPr>
+        <w:t>AIM</w:t>
+      </w:r>
+      <w:r>
+        <w:rPr>
+          <w:rFonts w:ascii="Times New Roman" w:hAnsi="Times New Roman" w:cs="Times New Roman"/>
+          <w:bCs/>
+          <w:sz w:val="24"/>
+          <w:szCs w:val="24"/>
+        </w:rPr>
+        <w:t>: TO analyze and compare the hardware specification of modern AI powered computer systems and understand how these specifications supports AI and machine learning workloads.</w:t>
+      </w:r>
+    </w:p>
+    <w:p>
+      <w:pPr>
+        <w:jc w:val="both"/>
+        <w:rPr>
+          <w:rFonts w:ascii="Times New Roman" w:hAnsi="Times New Roman" w:cs="Times New Roman"/>
+          <w:b/>
+          <w:bCs/>
+          <w:sz w:val="28"/>
+          <w:szCs w:val="24"/>
+          <w:u w:val="single"/>
+        </w:rPr>
+      </w:pPr>
+      <w:r>
+        <w:rPr>
+          <w:rFonts w:ascii="Times New Roman" w:hAnsi="Times New Roman" w:cs="Times New Roman"/>
+          <w:b/>
+          <w:bCs/>
+          <w:sz w:val="28"/>
+          <w:szCs w:val="24"/>
+          <w:u w:val="single"/>
+        </w:rPr>
+        <w:t>Theory</w:t>
+      </w:r>
+    </w:p>
+    <w:p>
+      <w:pPr>
+        <w:jc w:val="both"/>
+        <w:rPr>
+          <w:rFonts w:ascii="Times New Roman" w:hAnsi="Times New Roman" w:cs="Times New Roman"/>
+          <w:bCs/>
+          <w:sz w:val="24"/>
+          <w:szCs w:val="24"/>
+        </w:rPr>
+      </w:pPr>
+      <w:r>
+        <w:rPr>
+          <w:rFonts w:ascii="Times New Roman" w:hAnsi="Times New Roman" w:cs="Times New Roman"/>
+          <w:bCs/>
+          <w:sz w:val="24"/>
+          <w:szCs w:val="24"/>
+        </w:rPr>
+        <w:t>AI-powered systems require specialized hardware because Ai and Machine Learning applications performs large amount of data processing’s.</w:t>
+      </w:r>
+    </w:p>
+    <w:p>
+      <w:pPr>
+        <w:jc w:val="both"/>
+        <w:rPr>
+          <w:rFonts w:ascii="Times New Roman" w:hAnsi="Times New Roman" w:cs="Times New Roman"/>
+          <w:bCs/>
+          <w:sz w:val="24"/>
+          <w:szCs w:val="24"/>
+        </w:rPr>
+      </w:pPr>
+      <w:r>
+        <w:rPr>
+          <w:rFonts w:ascii="Times New Roman" w:hAnsi="Times New Roman" w:cs="Times New Roman"/>
+          <w:bCs/>
+          <w:sz w:val="24"/>
+          <w:szCs w:val="24"/>
+        </w:rPr>
+        <w:t>The main hardware components are:</w:t>
+      </w:r>
+    </w:p>
+    <w:p>
+      <w:pPr>
+        <w:pStyle w:val="ListParagraph"/>
+        <w:numPr>
+          <w:ilvl w:val="0"/>
+          <w:numId w:val="5"/>
+        </w:numPr>
+        <w:jc w:val="both"/>
+        <w:rPr>
+          <w:rFonts w:ascii="Times New Roman" w:hAnsi="Times New Roman" w:cs="Times New Roman"/>
+          <w:bCs/>
+          <w:sz w:val="24"/>
+          <w:szCs w:val="24"/>
+        </w:rPr>
+      </w:pPr>
+      <w:r>
+        <w:rPr>
+          <w:rFonts w:ascii="Times New Roman" w:hAnsi="Times New Roman" w:cs="Times New Roman"/>
+          <w:bCs/>
+          <w:sz w:val="24"/>
+          <w:szCs w:val="24"/>
+        </w:rPr>
+        <w:t>High-core CPU’s: Used for parallel processing and data preparation.</w:t>
+      </w:r>
+    </w:p>
+    <w:p>
+      <w:pPr>
+        <w:pStyle w:val="ListParagraph"/>
+        <w:numPr>
+          <w:ilvl w:val="0"/>
+          <w:numId w:val="5"/>
+        </w:numPr>
+        <w:jc w:val="both"/>
+        <w:rPr>
+          <w:rFonts w:ascii="Times New Roman" w:hAnsi="Times New Roman" w:cs="Times New Roman"/>
+          <w:bCs/>
+          <w:sz w:val="24"/>
+          <w:szCs w:val="24"/>
+        </w:rPr>
+      </w:pPr>
+      <w:r>
+        <w:rPr>
+          <w:rFonts w:ascii="Times New Roman" w:hAnsi="Times New Roman" w:cs="Times New Roman"/>
+          <w:bCs/>
+          <w:sz w:val="24"/>
+          <w:szCs w:val="24"/>
+        </w:rPr>
+        <w:t>GPU’s with CUDA cores: Used to accelerate Machine Learning and Deep Learning algorithms.</w:t>
+      </w:r>
+    </w:p>
+    <w:p>
+      <w:pPr>
+        <w:pStyle w:val="ListParagraph"/>
+        <w:numPr>
+          <w:ilvl w:val="0"/>
+          <w:numId w:val="5"/>
+        </w:numPr>
+        <w:jc w:val="both"/>
+        <w:rPr>
+          <w:rFonts w:ascii="Times New Roman" w:hAnsi="Times New Roman" w:cs="Times New Roman"/>
+          <w:bCs/>
+          <w:sz w:val="24"/>
+          <w:szCs w:val="24"/>
+        </w:rPr>
+      </w:pPr>
+      <w:r>
+        <w:rPr>
+          <w:rFonts w:ascii="Times New Roman" w:hAnsi="Times New Roman" w:cs="Times New Roman"/>
+          <w:bCs/>
+          <w:sz w:val="24"/>
+          <w:szCs w:val="24"/>
+        </w:rPr>
+        <w:t>High capacity RAM: Used to handle large datasets and model date.</w:t>
+      </w:r>
+    </w:p>
+    <w:p>
+      <w:pPr>
+        <w:pStyle w:val="ListParagraph"/>
+        <w:numPr>
+          <w:ilvl w:val="0"/>
+          <w:numId w:val="5"/>
+        </w:numPr>
+        <w:jc w:val="both"/>
+        <w:rPr>
+          <w:rFonts w:ascii="Times New Roman" w:hAnsi="Times New Roman" w:cs="Times New Roman"/>
+          <w:bCs/>
+          <w:sz w:val="24"/>
+          <w:szCs w:val="24"/>
+        </w:rPr>
+      </w:pPr>
+      <w:r>
+        <w:rPr>
+          <w:rFonts w:ascii="Times New Roman" w:hAnsi="Times New Roman" w:cs="Times New Roman"/>
+          <w:bCs/>
+          <w:sz w:val="24"/>
+          <w:szCs w:val="24"/>
+        </w:rPr>
+        <w:t>NVMe SSDs: Used for fast data access and storage.</w:t>
+      </w:r>
+    </w:p>
+    <w:p>
+      <w:pPr>
+        <w:jc w:val="both"/>
+        <w:rPr>
+          <w:rFonts w:ascii="Times New Roman" w:hAnsi="Times New Roman" w:cs="Times New Roman"/>
+          <w:b/>
+          <w:bCs/>
+          <w:sz w:val="28"/>
+          <w:szCs w:val="24"/>
+          <w:u w:val="single"/>
+        </w:rPr>
+      </w:pPr>
+      <w:r>
+        <w:rPr>
+          <w:rFonts w:ascii="Times New Roman" w:hAnsi="Times New Roman" w:cs="Times New Roman"/>
+          <w:b/>
+          <w:bCs/>
+          <w:sz w:val="28"/>
+          <w:szCs w:val="24"/>
+          <w:u w:val="single"/>
+        </w:rPr>
+        <w:t>Procedure</w:t>
+      </w:r>
+    </w:p>
+    <w:p>
+      <w:pPr>
+        <w:pStyle w:val="ListParagraph"/>
+        <w:numPr>
+          <w:ilvl w:val="0"/>
+          <w:numId w:val="6"/>
+        </w:numPr>
+        <w:jc w:val="both"/>
+        <w:rPr>
+          <w:rFonts w:ascii="Times New Roman" w:hAnsi="Times New Roman" w:cs="Times New Roman"/>
+          <w:bCs/>
+          <w:sz w:val="24"/>
+          <w:szCs w:val="24"/>
+        </w:rPr>
+      </w:pPr>
+      <w:r>
+        <w:rPr>
+          <w:rFonts w:ascii="Times New Roman" w:hAnsi="Times New Roman" w:cs="Times New Roman"/>
+          <w:bCs/>
+          <w:sz w:val="24"/>
+          <w:szCs w:val="24"/>
+        </w:rPr>
+        <w:t>The latest AI powered desktop and server systems available in 2025 were studied.</w:t>
+      </w:r>
+    </w:p>
+    <w:p>
+      <w:pPr>
+        <w:pStyle w:val="ListParagraph"/>
+        <w:numPr>
+          <w:ilvl w:val="0"/>
+          <w:numId w:val="6"/>
+        </w:numPr>
+        <w:jc w:val="both"/>
+        <w:rPr>
+          <w:rFonts w:ascii="Times New Roman" w:hAnsi="Times New Roman" w:cs="Times New Roman"/>
+          <w:bCs/>
+          <w:sz w:val="24"/>
+          <w:szCs w:val="24"/>
+        </w:rPr>
+      </w:pPr>
+      <w:r>
+        <w:rPr>
+          <w:rFonts w:ascii="Times New Roman" w:hAnsi="Times New Roman" w:cs="Times New Roman"/>
+          <w:bCs/>
+          <w:sz w:val="24"/>
+          <w:szCs w:val="24"/>
+        </w:rPr>
+        <w:t xml:space="preserve">Their CPU, </w:t>
+      </w:r>
+      <w:r>
+        <w:rPr>
+          <w:rFonts w:ascii="Times New Roman" w:hAnsi="Times New Roman" w:cs="Times New Roman"/>
+          <w:bCs/>
+          <w:sz w:val="24"/>
+          <w:szCs w:val="24"/>
+        </w:rPr>
+        <w:t>GPU</w:t>
+      </w:r>
+      <w:r>
+        <w:rPr>
+          <w:rFonts w:ascii="Times New Roman" w:hAnsi="Times New Roman" w:cs="Times New Roman"/>
+          <w:bCs/>
+          <w:sz w:val="24"/>
+          <w:szCs w:val="24"/>
+        </w:rPr>
+        <w:t>, and ram and storage specifications were collected.</w:t>
+      </w:r>
+    </w:p>
+    <w:p>
+      <w:pPr>
+        <w:pStyle w:val="ListParagraph"/>
+        <w:numPr>
+          <w:ilvl w:val="0"/>
+          <w:numId w:val="6"/>
+        </w:numPr>
+        <w:jc w:val="both"/>
+        <w:rPr>
+          <w:rFonts w:ascii="Times New Roman" w:hAnsi="Times New Roman" w:cs="Times New Roman"/>
+          <w:bCs/>
+          <w:sz w:val="24"/>
+          <w:szCs w:val="24"/>
+        </w:rPr>
+      </w:pPr>
+      <w:r>
+        <w:rPr>
+          <w:rFonts w:ascii="Times New Roman" w:hAnsi="Times New Roman" w:cs="Times New Roman"/>
+          <w:bCs/>
+          <w:sz w:val="24"/>
+          <w:szCs w:val="24"/>
+        </w:rPr>
+        <w:t>The specifications were compared.</w:t>
+      </w:r>
+    </w:p>
+    <w:p>
+      <w:pPr>
+        <w:pStyle w:val="ListParagraph"/>
+        <w:numPr>
+          <w:ilvl w:val="0"/>
+          <w:numId w:val="6"/>
+        </w:numPr>
+        <w:jc w:val="both"/>
+        <w:rPr>
+          <w:rFonts w:ascii="Times New Roman" w:hAnsi="Times New Roman" w:cs="Times New Roman"/>
+          <w:bCs/>
+          <w:sz w:val="24"/>
+          <w:szCs w:val="24"/>
+        </w:rPr>
+      </w:pPr>
+      <w:r>
+        <w:rPr>
+          <w:rFonts w:ascii="Times New Roman" w:hAnsi="Times New Roman" w:cs="Times New Roman"/>
+          <w:bCs/>
+          <w:sz w:val="24"/>
+          <w:szCs w:val="24"/>
+        </w:rPr>
+        <w:t>The effects of these specifications on AI and Machine-Learning workloads were analyzed.</w:t>
+      </w:r>
+    </w:p>
+    <w:p>
+      <w:pPr>
+        <w:jc w:val="both"/>
+        <w:rPr>
+          <w:rFonts w:ascii="Times New Roman" w:hAnsi="Times New Roman" w:cs="Times New Roman"/>
+          <w:b/>
+          <w:bCs/>
+          <w:sz w:val="28"/>
+          <w:szCs w:val="24"/>
+          <w:u w:val="single"/>
+        </w:rPr>
+      </w:pPr>
+      <w:r>
+        <w:rPr>
+          <w:rFonts w:ascii="Times New Roman" w:hAnsi="Times New Roman" w:cs="Times New Roman"/>
+          <w:b/>
+          <w:bCs/>
+          <w:sz w:val="28"/>
+          <w:szCs w:val="24"/>
+          <w:u w:val="single"/>
+        </w:rPr>
+        <w:t>Observation</w:t>
+      </w:r>
+    </w:p>
+    <w:p>
+      <w:pPr>
+        <w:jc w:val="both"/>
+        <w:rPr>
+          <w:rFonts w:ascii="Times New Roman" w:hAnsi="Times New Roman" w:cs="Times New Roman"/>
+          <w:bCs/>
+          <w:sz w:val="24"/>
+          <w:szCs w:val="24"/>
+        </w:rPr>
+      </w:pPr>
+      <w:r>
+        <w:rPr>
+          <w:rFonts w:ascii="Times New Roman" w:hAnsi="Times New Roman" w:cs="Times New Roman"/>
+          <w:bCs/>
+          <w:sz w:val="24"/>
+          <w:szCs w:val="24"/>
+        </w:rPr>
+        <w:t>For this study, AI powered systems from leading manufactures such as NVIDIA, Dell Technologies and AMD were considered.</w:t>
+      </w:r>
+    </w:p>
+    <w:p>
+      <w:pPr>
+        <w:jc w:val="both"/>
+        <w:rPr>
+          <w:rFonts w:ascii="Times New Roman" w:hAnsi="Times New Roman" w:cs="Times New Roman"/>
+          <w:b/>
+          <w:bCs/>
+          <w:sz w:val="28"/>
+          <w:szCs w:val="24"/>
+          <w:u w:val="single"/>
+        </w:rPr>
+      </w:pPr>
+    </w:p>
+    <w:p>
+      <w:pPr>
+        <w:jc w:val="both"/>
+        <w:rPr>
+          <w:rFonts w:ascii="Times New Roman" w:hAnsi="Times New Roman" w:cs="Times New Roman"/>
+          <w:b/>
+          <w:bCs/>
+          <w:sz w:val="28"/>
+          <w:szCs w:val="24"/>
+          <w:u w:val="single"/>
+        </w:rPr>
+      </w:pPr>
+    </w:p>
+    <w:p>
+      <w:pPr>
+        <w:jc w:val="both"/>
+        <w:rPr>
+          <w:rFonts w:ascii="Times New Roman" w:hAnsi="Times New Roman" w:cs="Times New Roman"/>
+          <w:b/>
+          <w:bCs/>
+          <w:sz w:val="28"/>
+          <w:szCs w:val="24"/>
+          <w:u w:val="single"/>
+        </w:rPr>
+      </w:pPr>
+    </w:p>
+    <w:p>
+      <w:pPr>
+        <w:jc w:val="both"/>
+        <w:rPr>
+          <w:rFonts w:ascii="Times New Roman" w:hAnsi="Times New Roman" w:cs="Times New Roman"/>
+          <w:b/>
+          <w:bCs/>
+          <w:sz w:val="28"/>
+          <w:szCs w:val="24"/>
+          <w:u w:val="single"/>
+        </w:rPr>
+      </w:pPr>
+    </w:p>
+    <w:p>
+      <w:pPr>
+        <w:jc w:val="both"/>
+        <w:rPr>
+          <w:rFonts w:ascii="Times New Roman" w:hAnsi="Times New Roman" w:cs="Times New Roman"/>
+          <w:b/>
+          <w:bCs/>
+          <w:sz w:val="28"/>
+          <w:szCs w:val="24"/>
+          <w:u w:val="single"/>
+        </w:rPr>
+      </w:pPr>
+      <w:r>
+        <w:rPr>
+          <w:rFonts w:ascii="Times New Roman" w:hAnsi="Times New Roman" w:cs="Times New Roman"/>
+          <w:b/>
+          <w:bCs/>
+          <w:sz w:val="28"/>
+          <w:szCs w:val="24"/>
+          <w:u w:val="single"/>
+        </w:rPr>
+        <w:lastRenderedPageBreak/>
+        <w:t>Comparison chart of hardware specifications</w:t>
+      </w:r>
+    </w:p>
+    <w:tbl>
+      <w:tblPr>
+        <w:tblStyle w:val="TableGrid"/>
+        <w:tblW w:w="0" w:type="auto"/>
+        <w:tblLook w:val="04A0" w:firstRow="1" w:lastRow="0" w:firstColumn="1" w:lastColumn="0" w:noHBand="0" w:noVBand="1"/>
+      </w:tblPr>
+      <w:tblGrid>
+        <w:gridCol w:w="1791"/>
+        <w:gridCol w:w="1564"/>
+        <w:gridCol w:w="1580"/>
+        <w:gridCol w:w="1550"/>
+        <w:gridCol w:w="1546"/>
+        <w:gridCol w:w="1545"/>
+      </w:tblGrid>
+      <w:tr>
+        <w:trPr>
+          <w:trHeight w:val="953"/>
+        </w:trPr>
+        <w:tc>
+          <w:tcPr>
+            <w:tcW w:w="1596" w:type="dxa"/>
+          </w:tcPr>
+          <w:p>
+            <w:pPr>
+              <w:jc w:val="center"/>
+              <w:rPr>
+                <w:rFonts w:ascii="Times New Roman" w:hAnsi="Times New Roman" w:cs="Times New Roman"/>
+                <w:b/>
+                <w:bCs/>
+                <w:sz w:val="24"/>
+                <w:szCs w:val="24"/>
+              </w:rPr>
+            </w:pPr>
+          </w:p>
+          <w:p>
+            <w:pPr>
+              <w:jc w:val="center"/>
+              <w:rPr>
+                <w:rFonts w:ascii="Times New Roman" w:hAnsi="Times New Roman" w:cs="Times New Roman"/>
+                <w:b/>
+                <w:bCs/>
+                <w:sz w:val="24"/>
+                <w:szCs w:val="24"/>
+              </w:rPr>
+            </w:pPr>
+            <w:r>
+              <w:rPr>
+                <w:rFonts w:ascii="Times New Roman" w:hAnsi="Times New Roman" w:cs="Times New Roman"/>
+                <w:b/>
+                <w:bCs/>
+                <w:sz w:val="24"/>
+                <w:szCs w:val="24"/>
+              </w:rPr>
+              <w:t>System studied</w:t>
+            </w:r>
+          </w:p>
+        </w:tc>
+        <w:tc>
+          <w:tcPr>
+            <w:tcW w:w="1596" w:type="dxa"/>
+          </w:tcPr>
+          <w:p>
+            <w:pPr>
+              <w:jc w:val="center"/>
+              <w:rPr>
+                <w:rFonts w:ascii="Times New Roman" w:hAnsi="Times New Roman" w:cs="Times New Roman"/>
+                <w:b/>
+                <w:bCs/>
+                <w:sz w:val="24"/>
+                <w:szCs w:val="24"/>
+              </w:rPr>
+            </w:pPr>
+          </w:p>
+          <w:p>
+            <w:pPr>
+              <w:jc w:val="center"/>
+              <w:rPr>
+                <w:rFonts w:ascii="Times New Roman" w:hAnsi="Times New Roman" w:cs="Times New Roman"/>
+                <w:b/>
+                <w:bCs/>
+                <w:sz w:val="24"/>
+                <w:szCs w:val="24"/>
+              </w:rPr>
+            </w:pPr>
+            <w:r>
+              <w:rPr>
+                <w:rFonts w:ascii="Times New Roman" w:hAnsi="Times New Roman" w:cs="Times New Roman"/>
+                <w:b/>
+                <w:bCs/>
+                <w:sz w:val="24"/>
+                <w:szCs w:val="24"/>
+              </w:rPr>
+              <w:t>CPU</w:t>
+            </w:r>
+          </w:p>
+        </w:tc>
+        <w:tc>
+          <w:tcPr>
+            <w:tcW w:w="1596" w:type="dxa"/>
+          </w:tcPr>
+          <w:p>
+            <w:pPr>
+              <w:jc w:val="center"/>
+              <w:rPr>
+                <w:rFonts w:ascii="Times New Roman" w:hAnsi="Times New Roman" w:cs="Times New Roman"/>
+                <w:b/>
+                <w:bCs/>
+                <w:sz w:val="24"/>
+                <w:szCs w:val="24"/>
+              </w:rPr>
+            </w:pPr>
+          </w:p>
+          <w:p>
+            <w:pPr>
+              <w:jc w:val="center"/>
+              <w:rPr>
+                <w:rFonts w:ascii="Times New Roman" w:hAnsi="Times New Roman" w:cs="Times New Roman"/>
+                <w:b/>
+                <w:bCs/>
+                <w:sz w:val="24"/>
+                <w:szCs w:val="24"/>
+              </w:rPr>
+            </w:pPr>
+            <w:r>
+              <w:rPr>
+                <w:rFonts w:ascii="Times New Roman" w:hAnsi="Times New Roman" w:cs="Times New Roman"/>
+                <w:b/>
+                <w:bCs/>
+                <w:sz w:val="24"/>
+                <w:szCs w:val="24"/>
+              </w:rPr>
+              <w:t>GPU/</w:t>
+            </w:r>
+          </w:p>
+          <w:p>
+            <w:pPr>
+              <w:jc w:val="center"/>
+              <w:rPr>
+                <w:rFonts w:ascii="Times New Roman" w:hAnsi="Times New Roman" w:cs="Times New Roman"/>
+                <w:b/>
+                <w:bCs/>
+                <w:sz w:val="24"/>
+                <w:szCs w:val="24"/>
+              </w:rPr>
+            </w:pPr>
+            <w:r>
+              <w:rPr>
+                <w:rFonts w:ascii="Times New Roman" w:hAnsi="Times New Roman" w:cs="Times New Roman"/>
+                <w:b/>
+                <w:bCs/>
+                <w:sz w:val="24"/>
+                <w:szCs w:val="24"/>
+              </w:rPr>
+              <w:t>Accelerator</w:t>
+            </w:r>
+          </w:p>
+        </w:tc>
+        <w:tc>
+          <w:tcPr>
+            <w:tcW w:w="1596" w:type="dxa"/>
+          </w:tcPr>
+          <w:p>
+            <w:pPr>
+              <w:jc w:val="center"/>
+              <w:rPr>
+                <w:rFonts w:ascii="Times New Roman" w:hAnsi="Times New Roman" w:cs="Times New Roman"/>
+                <w:b/>
+                <w:bCs/>
+                <w:sz w:val="24"/>
+                <w:szCs w:val="24"/>
+              </w:rPr>
+            </w:pPr>
+          </w:p>
+          <w:p>
+            <w:pPr>
+              <w:jc w:val="center"/>
+              <w:rPr>
+                <w:rFonts w:ascii="Times New Roman" w:hAnsi="Times New Roman" w:cs="Times New Roman"/>
+                <w:b/>
+                <w:bCs/>
+                <w:sz w:val="24"/>
+                <w:szCs w:val="24"/>
+              </w:rPr>
+            </w:pPr>
+            <w:r>
+              <w:rPr>
+                <w:rFonts w:ascii="Times New Roman" w:hAnsi="Times New Roman" w:cs="Times New Roman"/>
+                <w:b/>
+                <w:bCs/>
+                <w:sz w:val="24"/>
+                <w:szCs w:val="24"/>
+              </w:rPr>
+              <w:t>GPU memory</w:t>
+            </w:r>
+          </w:p>
+        </w:tc>
+        <w:tc>
+          <w:tcPr>
+            <w:tcW w:w="1596" w:type="dxa"/>
+          </w:tcPr>
+          <w:p>
+            <w:pPr>
+              <w:jc w:val="center"/>
+              <w:rPr>
+                <w:rFonts w:ascii="Times New Roman" w:hAnsi="Times New Roman" w:cs="Times New Roman"/>
+                <w:b/>
+                <w:bCs/>
+                <w:sz w:val="24"/>
+                <w:szCs w:val="24"/>
+              </w:rPr>
+            </w:pPr>
+          </w:p>
+          <w:p>
+            <w:pPr>
+              <w:jc w:val="center"/>
+              <w:rPr>
+                <w:rFonts w:ascii="Times New Roman" w:hAnsi="Times New Roman" w:cs="Times New Roman"/>
+                <w:b/>
+                <w:bCs/>
+                <w:sz w:val="24"/>
+                <w:szCs w:val="24"/>
+              </w:rPr>
+            </w:pPr>
+            <w:r>
+              <w:rPr>
+                <w:rFonts w:ascii="Times New Roman" w:hAnsi="Times New Roman" w:cs="Times New Roman"/>
+                <w:b/>
+                <w:bCs/>
+                <w:sz w:val="24"/>
+                <w:szCs w:val="24"/>
+              </w:rPr>
+              <w:t>System</w:t>
+            </w:r>
+          </w:p>
+          <w:p>
+            <w:pPr>
+              <w:jc w:val="center"/>
+              <w:rPr>
+                <w:rFonts w:ascii="Times New Roman" w:hAnsi="Times New Roman" w:cs="Times New Roman"/>
+                <w:b/>
+                <w:bCs/>
+                <w:sz w:val="24"/>
+                <w:szCs w:val="24"/>
+              </w:rPr>
+            </w:pPr>
+            <w:r>
+              <w:rPr>
+                <w:rFonts w:ascii="Times New Roman" w:hAnsi="Times New Roman" w:cs="Times New Roman"/>
+                <w:b/>
+                <w:bCs/>
+                <w:sz w:val="24"/>
+                <w:szCs w:val="24"/>
+              </w:rPr>
+              <w:t>RAM</w:t>
+            </w:r>
+          </w:p>
+        </w:tc>
+        <w:tc>
+          <w:tcPr>
+            <w:tcW w:w="1596" w:type="dxa"/>
+          </w:tcPr>
+          <w:p>
+            <w:pPr>
+              <w:jc w:val="center"/>
+              <w:rPr>
+                <w:rFonts w:ascii="Times New Roman" w:hAnsi="Times New Roman" w:cs="Times New Roman"/>
+                <w:b/>
+                <w:bCs/>
+                <w:sz w:val="24"/>
+                <w:szCs w:val="24"/>
+              </w:rPr>
+            </w:pPr>
+          </w:p>
+          <w:p>
+            <w:pPr>
+              <w:jc w:val="center"/>
+              <w:rPr>
+                <w:rFonts w:ascii="Times New Roman" w:hAnsi="Times New Roman" w:cs="Times New Roman"/>
+                <w:b/>
+                <w:bCs/>
+                <w:sz w:val="24"/>
+                <w:szCs w:val="24"/>
+              </w:rPr>
+            </w:pPr>
+            <w:r>
+              <w:rPr>
+                <w:rFonts w:ascii="Times New Roman" w:hAnsi="Times New Roman" w:cs="Times New Roman"/>
+                <w:b/>
+                <w:bCs/>
+                <w:sz w:val="24"/>
+                <w:szCs w:val="24"/>
+              </w:rPr>
+              <w:t>Storage</w:t>
+            </w:r>
+          </w:p>
+        </w:tc>
+      </w:tr>
+      <w:tr>
+        <w:trPr>
+          <w:trHeight w:val="935"/>
+        </w:trPr>
+        <w:tc>
+          <w:tcPr>
+            <w:tcW w:w="1596" w:type="dxa"/>
+          </w:tcPr>
+          <w:p>
+            <w:pPr>
+              <w:jc w:val="center"/>
+              <w:rPr>
+                <w:rFonts w:ascii="Times New Roman" w:hAnsi="Times New Roman" w:cs="Times New Roman"/>
+                <w:bCs/>
+                <w:sz w:val="24"/>
+                <w:szCs w:val="24"/>
+              </w:rPr>
+            </w:pPr>
+          </w:p>
+          <w:p>
+            <w:pPr>
+              <w:jc w:val="center"/>
+              <w:rPr>
+                <w:rFonts w:ascii="Times New Roman" w:hAnsi="Times New Roman" w:cs="Times New Roman"/>
+                <w:bCs/>
+                <w:sz w:val="24"/>
+                <w:szCs w:val="24"/>
+              </w:rPr>
+            </w:pPr>
+            <w:r>
+              <w:rPr>
+                <w:rFonts w:ascii="Times New Roman" w:hAnsi="Times New Roman" w:cs="Times New Roman"/>
+                <w:bCs/>
+                <w:sz w:val="24"/>
+                <w:szCs w:val="24"/>
+              </w:rPr>
+              <w:t>NVDIA-AI server(DGX class)</w:t>
+            </w:r>
+          </w:p>
+        </w:tc>
+        <w:tc>
+          <w:tcPr>
+            <w:tcW w:w="1596" w:type="dxa"/>
+          </w:tcPr>
+          <w:p>
+            <w:pPr>
+              <w:jc w:val="center"/>
+              <w:rPr>
+                <w:rFonts w:ascii="Times New Roman" w:hAnsi="Times New Roman" w:cs="Times New Roman"/>
+                <w:bCs/>
+                <w:sz w:val="24"/>
+                <w:szCs w:val="24"/>
+              </w:rPr>
+            </w:pPr>
+          </w:p>
+          <w:p>
+            <w:pPr>
+              <w:jc w:val="center"/>
+              <w:rPr>
+                <w:rFonts w:ascii="Times New Roman" w:hAnsi="Times New Roman" w:cs="Times New Roman"/>
+                <w:bCs/>
+                <w:sz w:val="24"/>
+                <w:szCs w:val="24"/>
+              </w:rPr>
+            </w:pPr>
+            <w:r>
+              <w:rPr>
+                <w:rFonts w:ascii="Times New Roman" w:hAnsi="Times New Roman" w:cs="Times New Roman"/>
+                <w:bCs/>
+                <w:sz w:val="24"/>
+                <w:szCs w:val="24"/>
+              </w:rPr>
+              <w:t>Dual</w:t>
+            </w:r>
+          </w:p>
+          <w:p>
+            <w:pPr>
+              <w:jc w:val="center"/>
+              <w:rPr>
+                <w:rFonts w:ascii="Times New Roman" w:hAnsi="Times New Roman" w:cs="Times New Roman"/>
+                <w:bCs/>
+                <w:sz w:val="24"/>
+                <w:szCs w:val="24"/>
+              </w:rPr>
+            </w:pPr>
+            <w:r>
+              <w:rPr>
+                <w:rFonts w:ascii="Times New Roman" w:hAnsi="Times New Roman" w:cs="Times New Roman"/>
+                <w:bCs/>
+                <w:sz w:val="24"/>
+                <w:szCs w:val="24"/>
+              </w:rPr>
+              <w:t>high-</w:t>
+            </w:r>
+            <w:r>
+              <w:rPr>
+                <w:rFonts w:ascii="Times New Roman" w:hAnsi="Times New Roman" w:cs="Times New Roman"/>
+                <w:bCs/>
+                <w:sz w:val="24"/>
+                <w:szCs w:val="24"/>
+              </w:rPr>
+              <w:t>core</w:t>
+            </w:r>
+            <w:r>
+              <w:rPr>
+                <w:rFonts w:ascii="Times New Roman" w:hAnsi="Times New Roman" w:cs="Times New Roman"/>
+                <w:bCs/>
+                <w:sz w:val="24"/>
+                <w:szCs w:val="24"/>
+              </w:rPr>
+              <w:t xml:space="preserve"> server CPU</w:t>
+            </w:r>
+          </w:p>
+        </w:tc>
+        <w:tc>
+          <w:tcPr>
+            <w:tcW w:w="1596" w:type="dxa"/>
+          </w:tcPr>
+          <w:p>
+            <w:pPr>
+              <w:jc w:val="center"/>
+              <w:rPr>
+                <w:rFonts w:ascii="Times New Roman" w:hAnsi="Times New Roman" w:cs="Times New Roman"/>
+                <w:bCs/>
+                <w:sz w:val="24"/>
+                <w:szCs w:val="24"/>
+              </w:rPr>
+            </w:pPr>
+          </w:p>
+          <w:p>
+            <w:pPr>
+              <w:jc w:val="center"/>
+              <w:rPr>
+                <w:rFonts w:ascii="Times New Roman" w:hAnsi="Times New Roman" w:cs="Times New Roman"/>
+                <w:bCs/>
+                <w:sz w:val="24"/>
+                <w:szCs w:val="24"/>
+              </w:rPr>
+            </w:pPr>
+            <w:r>
+              <w:rPr>
+                <w:rFonts w:ascii="Times New Roman" w:hAnsi="Times New Roman" w:cs="Times New Roman"/>
+                <w:bCs/>
+                <w:sz w:val="24"/>
+                <w:szCs w:val="24"/>
+              </w:rPr>
+              <w:t>8x AI GPUs</w:t>
+            </w:r>
+          </w:p>
+        </w:tc>
+        <w:tc>
+          <w:tcPr>
+            <w:tcW w:w="1596" w:type="dxa"/>
+          </w:tcPr>
+          <w:p>
+            <w:pPr>
+              <w:jc w:val="both"/>
+              <w:rPr>
+                <w:rFonts w:ascii="Times New Roman" w:hAnsi="Times New Roman" w:cs="Times New Roman"/>
+                <w:bCs/>
+                <w:sz w:val="24"/>
+                <w:szCs w:val="24"/>
+              </w:rPr>
+            </w:pPr>
+          </w:p>
+          <w:p>
+            <w:pPr>
+              <w:jc w:val="both"/>
+              <w:rPr>
+                <w:rFonts w:ascii="Times New Roman" w:hAnsi="Times New Roman" w:cs="Times New Roman"/>
+                <w:bCs/>
+                <w:sz w:val="24"/>
+                <w:szCs w:val="24"/>
+              </w:rPr>
+            </w:pPr>
+            <w:r>
+              <w:rPr>
+                <w:rFonts w:ascii="Times New Roman" w:hAnsi="Times New Roman" w:cs="Times New Roman"/>
+                <w:bCs/>
+                <w:sz w:val="24"/>
+                <w:szCs w:val="24"/>
+              </w:rPr>
+              <w:t>80GB HBM per GPU</w:t>
+            </w:r>
+          </w:p>
+        </w:tc>
+        <w:tc>
+          <w:tcPr>
+            <w:tcW w:w="1596" w:type="dxa"/>
+          </w:tcPr>
+          <w:p>
+            <w:pPr>
+              <w:jc w:val="both"/>
+              <w:rPr>
+                <w:rFonts w:ascii="Times New Roman" w:hAnsi="Times New Roman" w:cs="Times New Roman"/>
+                <w:bCs/>
+                <w:sz w:val="24"/>
+                <w:szCs w:val="24"/>
+              </w:rPr>
+            </w:pPr>
+          </w:p>
+          <w:p>
+            <w:pPr>
+              <w:jc w:val="both"/>
+              <w:rPr>
+                <w:rFonts w:ascii="Times New Roman" w:hAnsi="Times New Roman" w:cs="Times New Roman"/>
+                <w:bCs/>
+                <w:sz w:val="24"/>
+                <w:szCs w:val="24"/>
+              </w:rPr>
+            </w:pPr>
+            <w:r>
+              <w:rPr>
+                <w:rFonts w:ascii="Times New Roman" w:hAnsi="Times New Roman" w:cs="Times New Roman"/>
+                <w:bCs/>
+                <w:sz w:val="24"/>
+                <w:szCs w:val="24"/>
+              </w:rPr>
+              <w:t xml:space="preserve">Up to </w:t>
+            </w:r>
+          </w:p>
+          <w:p>
+            <w:pPr>
+              <w:jc w:val="both"/>
+              <w:rPr>
+                <w:rFonts w:ascii="Times New Roman" w:hAnsi="Times New Roman" w:cs="Times New Roman"/>
+                <w:bCs/>
+                <w:sz w:val="24"/>
+                <w:szCs w:val="24"/>
+              </w:rPr>
+            </w:pPr>
+            <w:r>
+              <w:rPr>
+                <w:rFonts w:ascii="Times New Roman" w:hAnsi="Times New Roman" w:cs="Times New Roman"/>
+                <w:bCs/>
+                <w:sz w:val="24"/>
+                <w:szCs w:val="24"/>
+              </w:rPr>
+              <w:t>1 - 2 TB</w:t>
+            </w:r>
+          </w:p>
+        </w:tc>
+        <w:tc>
+          <w:tcPr>
+            <w:tcW w:w="1596" w:type="dxa"/>
+          </w:tcPr>
+          <w:p>
+            <w:pPr>
+              <w:jc w:val="both"/>
+              <w:rPr>
+                <w:rFonts w:ascii="Times New Roman" w:hAnsi="Times New Roman" w:cs="Times New Roman"/>
+                <w:bCs/>
+                <w:sz w:val="24"/>
+                <w:szCs w:val="24"/>
+              </w:rPr>
+            </w:pPr>
+          </w:p>
+          <w:p>
+            <w:pPr>
+              <w:jc w:val="both"/>
+              <w:rPr>
+                <w:rFonts w:ascii="Times New Roman" w:hAnsi="Times New Roman" w:cs="Times New Roman"/>
+                <w:bCs/>
+                <w:sz w:val="24"/>
+                <w:szCs w:val="24"/>
+              </w:rPr>
+            </w:pPr>
+          </w:p>
+          <w:p>
+            <w:pPr>
+              <w:jc w:val="both"/>
+              <w:rPr>
+                <w:rFonts w:ascii="Times New Roman" w:hAnsi="Times New Roman" w:cs="Times New Roman"/>
+                <w:bCs/>
+                <w:sz w:val="24"/>
+                <w:szCs w:val="24"/>
+              </w:rPr>
+            </w:pPr>
+            <w:r>
+              <w:rPr>
+                <w:rFonts w:ascii="Times New Roman" w:hAnsi="Times New Roman" w:cs="Times New Roman"/>
+                <w:bCs/>
+                <w:sz w:val="24"/>
+                <w:szCs w:val="24"/>
+              </w:rPr>
+              <w:t>NVMe SSD</w:t>
+            </w:r>
+          </w:p>
+        </w:tc>
+      </w:tr>
+      <w:tr>
+        <w:trPr>
+          <w:trHeight w:val="1115"/>
+        </w:trPr>
+        <w:tc>
+          <w:tcPr>
+            <w:tcW w:w="1596" w:type="dxa"/>
+          </w:tcPr>
+          <w:p>
+            <w:pPr>
+              <w:jc w:val="center"/>
+              <w:rPr>
+                <w:rFonts w:ascii="Times New Roman" w:hAnsi="Times New Roman" w:cs="Times New Roman"/>
+                <w:bCs/>
+                <w:sz w:val="24"/>
+                <w:szCs w:val="24"/>
+              </w:rPr>
+            </w:pPr>
+          </w:p>
+          <w:p>
+            <w:pPr>
+              <w:jc w:val="center"/>
+              <w:rPr>
+                <w:rFonts w:ascii="Times New Roman" w:hAnsi="Times New Roman" w:cs="Times New Roman"/>
+                <w:bCs/>
+                <w:sz w:val="24"/>
+                <w:szCs w:val="24"/>
+              </w:rPr>
+            </w:pPr>
+            <w:r>
+              <w:rPr>
+                <w:rFonts w:ascii="Times New Roman" w:hAnsi="Times New Roman" w:cs="Times New Roman"/>
+                <w:bCs/>
+                <w:sz w:val="24"/>
+                <w:szCs w:val="24"/>
+              </w:rPr>
+              <w:t>Dell-AI server(XE class)</w:t>
+            </w:r>
+          </w:p>
+        </w:tc>
+        <w:tc>
+          <w:tcPr>
+            <w:tcW w:w="1596" w:type="dxa"/>
+          </w:tcPr>
+          <w:p>
+            <w:pPr>
+              <w:jc w:val="center"/>
+              <w:rPr>
+                <w:rFonts w:ascii="Times New Roman" w:hAnsi="Times New Roman" w:cs="Times New Roman"/>
+                <w:bCs/>
+                <w:sz w:val="24"/>
+                <w:szCs w:val="24"/>
+              </w:rPr>
+            </w:pPr>
+          </w:p>
+          <w:p>
+            <w:pPr>
+              <w:jc w:val="center"/>
+              <w:rPr>
+                <w:rFonts w:ascii="Times New Roman" w:hAnsi="Times New Roman" w:cs="Times New Roman"/>
+                <w:bCs/>
+                <w:sz w:val="24"/>
+                <w:szCs w:val="24"/>
+              </w:rPr>
+            </w:pPr>
+            <w:r>
+              <w:rPr>
+                <w:rFonts w:ascii="Times New Roman" w:hAnsi="Times New Roman" w:cs="Times New Roman"/>
+                <w:bCs/>
+                <w:sz w:val="24"/>
+                <w:szCs w:val="24"/>
+              </w:rPr>
+              <w:t>Dual</w:t>
+            </w:r>
+          </w:p>
+          <w:p>
+            <w:pPr>
+              <w:jc w:val="center"/>
+              <w:rPr>
+                <w:rFonts w:ascii="Times New Roman" w:hAnsi="Times New Roman" w:cs="Times New Roman"/>
+                <w:bCs/>
+                <w:sz w:val="24"/>
+                <w:szCs w:val="24"/>
+              </w:rPr>
+            </w:pPr>
+            <w:r>
+              <w:rPr>
+                <w:rFonts w:ascii="Times New Roman" w:hAnsi="Times New Roman" w:cs="Times New Roman"/>
+                <w:bCs/>
+                <w:sz w:val="24"/>
+                <w:szCs w:val="24"/>
+              </w:rPr>
+              <w:t>Intel Xeon</w:t>
+            </w:r>
+          </w:p>
+          <w:p>
+            <w:pPr>
+              <w:jc w:val="center"/>
+              <w:rPr>
+                <w:rFonts w:ascii="Times New Roman" w:hAnsi="Times New Roman" w:cs="Times New Roman"/>
+                <w:bCs/>
+                <w:sz w:val="24"/>
+                <w:szCs w:val="24"/>
+              </w:rPr>
+            </w:pPr>
+            <w:r>
+              <w:rPr>
+                <w:rFonts w:ascii="Times New Roman" w:hAnsi="Times New Roman" w:cs="Times New Roman"/>
+                <w:bCs/>
+                <w:sz w:val="24"/>
+                <w:szCs w:val="24"/>
+              </w:rPr>
+              <w:t>processors</w:t>
+            </w:r>
+          </w:p>
+        </w:tc>
+        <w:tc>
+          <w:tcPr>
+            <w:tcW w:w="1596" w:type="dxa"/>
+          </w:tcPr>
+          <w:p>
+            <w:pPr>
+              <w:jc w:val="center"/>
+              <w:rPr>
+                <w:rFonts w:ascii="Times New Roman" w:hAnsi="Times New Roman" w:cs="Times New Roman"/>
+                <w:bCs/>
+                <w:sz w:val="24"/>
+                <w:szCs w:val="24"/>
+              </w:rPr>
+            </w:pPr>
+          </w:p>
+          <w:p>
+            <w:pPr>
+              <w:jc w:val="center"/>
+              <w:rPr>
+                <w:rFonts w:ascii="Times New Roman" w:hAnsi="Times New Roman" w:cs="Times New Roman"/>
+                <w:bCs/>
+                <w:sz w:val="24"/>
+                <w:szCs w:val="24"/>
+              </w:rPr>
+            </w:pPr>
+            <w:r>
+              <w:rPr>
+                <w:rFonts w:ascii="Times New Roman" w:hAnsi="Times New Roman" w:cs="Times New Roman"/>
+                <w:bCs/>
+                <w:sz w:val="24"/>
+                <w:szCs w:val="24"/>
+              </w:rPr>
+              <w:t>Up to 8 AI GPUs</w:t>
+            </w:r>
+          </w:p>
+        </w:tc>
+        <w:tc>
+          <w:tcPr>
+            <w:tcW w:w="1596" w:type="dxa"/>
+          </w:tcPr>
+          <w:p>
+            <w:pPr>
+              <w:jc w:val="both"/>
+              <w:rPr>
+                <w:rFonts w:ascii="Times New Roman" w:hAnsi="Times New Roman" w:cs="Times New Roman"/>
+                <w:bCs/>
+                <w:sz w:val="24"/>
+                <w:szCs w:val="24"/>
+              </w:rPr>
+            </w:pPr>
+          </w:p>
+          <w:p>
+            <w:pPr>
+              <w:jc w:val="both"/>
+              <w:rPr>
+                <w:rFonts w:ascii="Times New Roman" w:hAnsi="Times New Roman" w:cs="Times New Roman"/>
+                <w:bCs/>
+                <w:sz w:val="24"/>
+                <w:szCs w:val="24"/>
+              </w:rPr>
+            </w:pPr>
+            <w:r>
+              <w:rPr>
+                <w:rFonts w:ascii="Times New Roman" w:hAnsi="Times New Roman" w:cs="Times New Roman"/>
+                <w:bCs/>
+                <w:sz w:val="24"/>
+                <w:szCs w:val="24"/>
+              </w:rPr>
+              <w:t xml:space="preserve">80GB </w:t>
+            </w:r>
+          </w:p>
+          <w:p>
+            <w:pPr>
+              <w:jc w:val="both"/>
+              <w:rPr>
+                <w:rFonts w:ascii="Times New Roman" w:hAnsi="Times New Roman" w:cs="Times New Roman"/>
+                <w:bCs/>
+                <w:sz w:val="24"/>
+                <w:szCs w:val="24"/>
+              </w:rPr>
+            </w:pPr>
+            <w:r>
+              <w:rPr>
+                <w:rFonts w:ascii="Times New Roman" w:hAnsi="Times New Roman" w:cs="Times New Roman"/>
+                <w:bCs/>
+                <w:sz w:val="24"/>
+                <w:szCs w:val="24"/>
+              </w:rPr>
+              <w:t>per GPU</w:t>
+            </w:r>
+          </w:p>
+        </w:tc>
+        <w:tc>
+          <w:tcPr>
+            <w:tcW w:w="1596" w:type="dxa"/>
+          </w:tcPr>
+          <w:p>
+            <w:pPr>
+              <w:jc w:val="both"/>
+              <w:rPr>
+                <w:rFonts w:ascii="Times New Roman" w:hAnsi="Times New Roman" w:cs="Times New Roman"/>
+                <w:bCs/>
+                <w:sz w:val="24"/>
+                <w:szCs w:val="24"/>
+              </w:rPr>
+            </w:pPr>
+          </w:p>
+          <w:p>
+            <w:pPr>
+              <w:jc w:val="both"/>
+              <w:rPr>
+                <w:rFonts w:ascii="Times New Roman" w:hAnsi="Times New Roman" w:cs="Times New Roman"/>
+                <w:bCs/>
+                <w:sz w:val="24"/>
+                <w:szCs w:val="24"/>
+              </w:rPr>
+            </w:pPr>
+          </w:p>
+          <w:p>
+            <w:pPr>
+              <w:jc w:val="both"/>
+              <w:rPr>
+                <w:rFonts w:ascii="Times New Roman" w:hAnsi="Times New Roman" w:cs="Times New Roman"/>
+                <w:bCs/>
+                <w:sz w:val="24"/>
+                <w:szCs w:val="24"/>
+              </w:rPr>
+            </w:pPr>
+            <w:r>
+              <w:rPr>
+                <w:rFonts w:ascii="Times New Roman" w:hAnsi="Times New Roman" w:cs="Times New Roman"/>
+                <w:bCs/>
+                <w:sz w:val="24"/>
+                <w:szCs w:val="24"/>
+              </w:rPr>
+              <w:t>U</w:t>
+            </w:r>
+            <w:r>
+              <w:rPr>
+                <w:rFonts w:ascii="Times New Roman" w:hAnsi="Times New Roman" w:cs="Times New Roman"/>
+                <w:bCs/>
+                <w:sz w:val="24"/>
+                <w:szCs w:val="24"/>
+              </w:rPr>
+              <w:t>p to 2TB</w:t>
+            </w:r>
+          </w:p>
+        </w:tc>
+        <w:tc>
+          <w:tcPr>
+            <w:tcW w:w="1596" w:type="dxa"/>
+          </w:tcPr>
+          <w:p>
+            <w:pPr>
+              <w:jc w:val="both"/>
+              <w:rPr>
+                <w:rFonts w:ascii="Times New Roman" w:hAnsi="Times New Roman" w:cs="Times New Roman"/>
+                <w:bCs/>
+                <w:sz w:val="24"/>
+                <w:szCs w:val="24"/>
+              </w:rPr>
+            </w:pPr>
+          </w:p>
+          <w:p>
+            <w:pPr>
+              <w:jc w:val="both"/>
+              <w:rPr>
+                <w:rFonts w:ascii="Times New Roman" w:hAnsi="Times New Roman" w:cs="Times New Roman"/>
+                <w:bCs/>
+                <w:sz w:val="24"/>
+                <w:szCs w:val="24"/>
+              </w:rPr>
+            </w:pPr>
+          </w:p>
+          <w:p>
+            <w:pPr>
+              <w:jc w:val="both"/>
+              <w:rPr>
+                <w:rFonts w:ascii="Times New Roman" w:hAnsi="Times New Roman" w:cs="Times New Roman"/>
+                <w:bCs/>
+                <w:sz w:val="24"/>
+                <w:szCs w:val="24"/>
+              </w:rPr>
+            </w:pPr>
+            <w:r>
+              <w:rPr>
+                <w:rFonts w:ascii="Times New Roman" w:hAnsi="Times New Roman" w:cs="Times New Roman"/>
+                <w:bCs/>
+                <w:sz w:val="24"/>
+                <w:szCs w:val="24"/>
+              </w:rPr>
+              <w:t>NVMe SSD</w:t>
+            </w:r>
+          </w:p>
+        </w:tc>
+      </w:tr>
+      <w:tr>
+        <w:trPr>
+          <w:trHeight w:val="1205"/>
+        </w:trPr>
+        <w:tc>
+          <w:tcPr>
+            <w:tcW w:w="1596" w:type="dxa"/>
+          </w:tcPr>
+          <w:p>
+            <w:pPr>
+              <w:jc w:val="center"/>
+              <w:rPr>
+                <w:rFonts w:ascii="Times New Roman" w:hAnsi="Times New Roman" w:cs="Times New Roman"/>
+                <w:bCs/>
+                <w:sz w:val="24"/>
+                <w:szCs w:val="24"/>
+              </w:rPr>
+            </w:pPr>
+          </w:p>
+          <w:p>
+            <w:pPr>
+              <w:jc w:val="center"/>
+              <w:rPr>
+                <w:rFonts w:ascii="Times New Roman" w:hAnsi="Times New Roman" w:cs="Times New Roman"/>
+                <w:bCs/>
+                <w:sz w:val="24"/>
+                <w:szCs w:val="24"/>
+              </w:rPr>
+            </w:pPr>
+            <w:r>
+              <w:rPr>
+                <w:rFonts w:ascii="Times New Roman" w:hAnsi="Times New Roman" w:cs="Times New Roman"/>
+                <w:bCs/>
+                <w:sz w:val="24"/>
+                <w:szCs w:val="24"/>
+              </w:rPr>
+              <w:t>AMD-AI system(m1300A based)</w:t>
+            </w:r>
+          </w:p>
+        </w:tc>
+        <w:tc>
+          <w:tcPr>
+            <w:tcW w:w="1596" w:type="dxa"/>
+          </w:tcPr>
+          <w:p>
+            <w:pPr>
+              <w:jc w:val="center"/>
+              <w:rPr>
+                <w:rFonts w:ascii="Times New Roman" w:hAnsi="Times New Roman" w:cs="Times New Roman"/>
+                <w:bCs/>
+                <w:sz w:val="24"/>
+                <w:szCs w:val="24"/>
+              </w:rPr>
+            </w:pPr>
+          </w:p>
+          <w:p>
+            <w:pPr>
+              <w:jc w:val="center"/>
+              <w:rPr>
+                <w:rFonts w:ascii="Times New Roman" w:hAnsi="Times New Roman" w:cs="Times New Roman"/>
+                <w:bCs/>
+                <w:sz w:val="24"/>
+                <w:szCs w:val="24"/>
+              </w:rPr>
+            </w:pPr>
+            <w:r>
+              <w:rPr>
+                <w:rFonts w:ascii="Times New Roman" w:hAnsi="Times New Roman" w:cs="Times New Roman"/>
+                <w:bCs/>
+                <w:sz w:val="24"/>
+                <w:szCs w:val="24"/>
+              </w:rPr>
+              <w:t>Integrated</w:t>
+            </w:r>
+          </w:p>
+          <w:p>
+            <w:pPr>
+              <w:jc w:val="center"/>
+              <w:rPr>
+                <w:rFonts w:ascii="Times New Roman" w:hAnsi="Times New Roman" w:cs="Times New Roman"/>
+                <w:bCs/>
+                <w:sz w:val="24"/>
+                <w:szCs w:val="24"/>
+              </w:rPr>
+            </w:pPr>
+            <w:r>
+              <w:rPr>
+                <w:rFonts w:ascii="Times New Roman" w:hAnsi="Times New Roman" w:cs="Times New Roman"/>
+                <w:bCs/>
+                <w:sz w:val="24"/>
+                <w:szCs w:val="24"/>
+              </w:rPr>
+              <w:t>Zen-4 CPU</w:t>
+            </w:r>
+          </w:p>
+        </w:tc>
+        <w:tc>
+          <w:tcPr>
+            <w:tcW w:w="1596" w:type="dxa"/>
+          </w:tcPr>
+          <w:p>
+            <w:pPr>
+              <w:jc w:val="center"/>
+              <w:rPr>
+                <w:rFonts w:ascii="Times New Roman" w:hAnsi="Times New Roman" w:cs="Times New Roman"/>
+                <w:bCs/>
+                <w:sz w:val="24"/>
+                <w:szCs w:val="24"/>
+              </w:rPr>
+            </w:pPr>
+          </w:p>
+          <w:p>
+            <w:pPr>
+              <w:jc w:val="center"/>
+              <w:rPr>
+                <w:rFonts w:ascii="Times New Roman" w:hAnsi="Times New Roman" w:cs="Times New Roman"/>
+                <w:bCs/>
+                <w:sz w:val="24"/>
+                <w:szCs w:val="24"/>
+              </w:rPr>
+            </w:pPr>
+            <w:r>
+              <w:rPr>
+                <w:rFonts w:ascii="Times New Roman" w:hAnsi="Times New Roman" w:cs="Times New Roman"/>
+                <w:bCs/>
+                <w:sz w:val="24"/>
+                <w:szCs w:val="24"/>
+              </w:rPr>
+              <w:t>AI accelerators</w:t>
+            </w:r>
+          </w:p>
+        </w:tc>
+        <w:tc>
+          <w:tcPr>
+            <w:tcW w:w="1596" w:type="dxa"/>
+          </w:tcPr>
+          <w:p>
+            <w:pPr>
+              <w:jc w:val="both"/>
+              <w:rPr>
+                <w:rFonts w:ascii="Times New Roman" w:hAnsi="Times New Roman" w:cs="Times New Roman"/>
+                <w:bCs/>
+                <w:sz w:val="24"/>
+                <w:szCs w:val="24"/>
+              </w:rPr>
+            </w:pPr>
+          </w:p>
+          <w:p>
+            <w:pPr>
+              <w:jc w:val="both"/>
+              <w:rPr>
+                <w:rFonts w:ascii="Times New Roman" w:hAnsi="Times New Roman" w:cs="Times New Roman"/>
+                <w:bCs/>
+                <w:sz w:val="24"/>
+                <w:szCs w:val="24"/>
+              </w:rPr>
+            </w:pPr>
+          </w:p>
+          <w:p>
+            <w:pPr>
+              <w:jc w:val="both"/>
+              <w:rPr>
+                <w:rFonts w:ascii="Times New Roman" w:hAnsi="Times New Roman" w:cs="Times New Roman"/>
+                <w:bCs/>
+                <w:sz w:val="24"/>
+                <w:szCs w:val="24"/>
+              </w:rPr>
+            </w:pPr>
+            <w:r>
+              <w:rPr>
+                <w:rFonts w:ascii="Times New Roman" w:hAnsi="Times New Roman" w:cs="Times New Roman"/>
+                <w:bCs/>
+                <w:sz w:val="24"/>
+                <w:szCs w:val="24"/>
+              </w:rPr>
+              <w:t>128GB HBM</w:t>
+            </w:r>
+          </w:p>
+        </w:tc>
+        <w:tc>
+          <w:tcPr>
+            <w:tcW w:w="1596" w:type="dxa"/>
+          </w:tcPr>
+          <w:p>
+            <w:pPr>
+              <w:jc w:val="both"/>
+              <w:rPr>
+                <w:rFonts w:ascii="Times New Roman" w:hAnsi="Times New Roman" w:cs="Times New Roman"/>
+                <w:bCs/>
+                <w:sz w:val="24"/>
+                <w:szCs w:val="24"/>
+              </w:rPr>
+            </w:pPr>
+          </w:p>
+          <w:p>
+            <w:pPr>
+              <w:jc w:val="both"/>
+              <w:rPr>
+                <w:rFonts w:ascii="Times New Roman" w:hAnsi="Times New Roman" w:cs="Times New Roman"/>
+                <w:bCs/>
+                <w:sz w:val="24"/>
+                <w:szCs w:val="24"/>
+              </w:rPr>
+            </w:pPr>
+            <w:r>
+              <w:rPr>
+                <w:rFonts w:ascii="Times New Roman" w:hAnsi="Times New Roman" w:cs="Times New Roman"/>
+                <w:bCs/>
+                <w:sz w:val="24"/>
+                <w:szCs w:val="24"/>
+              </w:rPr>
+              <w:t>Large unified memory</w:t>
+            </w:r>
+          </w:p>
+        </w:tc>
+        <w:tc>
+          <w:tcPr>
+            <w:tcW w:w="1596" w:type="dxa"/>
+          </w:tcPr>
+          <w:p>
+            <w:pPr>
+              <w:jc w:val="both"/>
+              <w:rPr>
+                <w:rFonts w:ascii="Times New Roman" w:hAnsi="Times New Roman" w:cs="Times New Roman"/>
+                <w:bCs/>
+                <w:sz w:val="24"/>
+                <w:szCs w:val="24"/>
+              </w:rPr>
+            </w:pPr>
+          </w:p>
+          <w:p>
+            <w:pPr>
+              <w:jc w:val="both"/>
+              <w:rPr>
+                <w:rFonts w:ascii="Times New Roman" w:hAnsi="Times New Roman" w:cs="Times New Roman"/>
+                <w:bCs/>
+                <w:sz w:val="24"/>
+                <w:szCs w:val="24"/>
+              </w:rPr>
+            </w:pPr>
+          </w:p>
+          <w:p>
+            <w:pPr>
+              <w:jc w:val="both"/>
+              <w:rPr>
+                <w:rFonts w:ascii="Times New Roman" w:hAnsi="Times New Roman" w:cs="Times New Roman"/>
+                <w:bCs/>
+                <w:sz w:val="24"/>
+                <w:szCs w:val="24"/>
+              </w:rPr>
+            </w:pPr>
+            <w:r>
+              <w:rPr>
+                <w:rFonts w:ascii="Times New Roman" w:hAnsi="Times New Roman" w:cs="Times New Roman"/>
+                <w:bCs/>
+                <w:sz w:val="24"/>
+                <w:szCs w:val="24"/>
+              </w:rPr>
+              <w:t>NVMe SSD</w:t>
+            </w:r>
+          </w:p>
+        </w:tc>
+      </w:tr>
+    </w:tbl>
+    <w:p>
+      <w:pPr>
+        <w:jc w:val="both"/>
+        <w:rPr>
+          <w:rFonts w:ascii="Times New Roman" w:hAnsi="Times New Roman" w:cs="Times New Roman"/>
+          <w:bCs/>
+          <w:sz w:val="24"/>
+          <w:szCs w:val="24"/>
+        </w:rPr>
+      </w:pPr>
+    </w:p>
+    <w:p>
+      <w:pPr>
+        <w:jc w:val="both"/>
+        <w:rPr>
+          <w:rFonts w:ascii="Times New Roman" w:hAnsi="Times New Roman" w:cs="Times New Roman"/>
+          <w:b/>
+          <w:bCs/>
+          <w:sz w:val="24"/>
+          <w:szCs w:val="24"/>
+        </w:rPr>
+      </w:pPr>
+    </w:p>
+    <w:p>
+      <w:pPr>
+        <w:jc w:val="both"/>
+        <w:rPr>
+          <w:rFonts w:ascii="Times New Roman" w:hAnsi="Times New Roman" w:cs="Times New Roman"/>
+          <w:b/>
+          <w:sz w:val="28"/>
+          <w:szCs w:val="28"/>
+          <w:u w:val="single"/>
+        </w:rPr>
+      </w:pPr>
+      <w:r>
+        <w:rPr>
+          <w:rFonts w:ascii="Times New Roman" w:hAnsi="Times New Roman" w:cs="Times New Roman"/>
+          <w:b/>
+          <w:sz w:val="28"/>
+          <w:szCs w:val="28"/>
+          <w:u w:val="single"/>
+        </w:rPr>
+        <w:t>Report</w:t>
+      </w:r>
+      <w:r>
+        <w:rPr>
+          <w:rFonts w:ascii="Times New Roman" w:hAnsi="Times New Roman" w:cs="Times New Roman"/>
+          <w:b/>
+          <w:sz w:val="28"/>
+          <w:szCs w:val="28"/>
+          <w:u w:val="single"/>
+        </w:rPr>
+        <w:t>-How these specifications support AI applications</w:t>
+      </w:r>
+    </w:p>
+    <w:p>
+      <w:pPr>
+        <w:pStyle w:val="ListParagraph"/>
+        <w:numPr>
+          <w:ilvl w:val="0"/>
+          <w:numId w:val="8"/>
+        </w:numPr>
+        <w:jc w:val="both"/>
+        <w:rPr>
+          <w:rFonts w:ascii="Times New Roman" w:hAnsi="Times New Roman" w:cs="Times New Roman"/>
+          <w:b/>
+          <w:sz w:val="28"/>
+          <w:szCs w:val="28"/>
+          <w:u w:val="single"/>
+        </w:rPr>
+      </w:pPr>
+      <w:r>
+        <w:rPr>
+          <w:rFonts w:ascii="Times New Roman" w:hAnsi="Times New Roman" w:cs="Times New Roman"/>
+          <w:b/>
+          <w:noProof/>
+          <w:sz w:val="28"/>
+          <w:szCs w:val="28"/>
+          <w:u w:val="single"/>
+        </w:rPr>
+        <w:drawing>
+          <wp:anchor distT="0" distB="0" distL="114300" distR="114300" simplePos="0" relativeHeight="251669504" behindDoc="0" locked="0" layoutInCell="1" allowOverlap="1" wp14:anchorId="453AEC86" wp14:editId="73D956FD">
+            <wp:simplePos x="0" y="0"/>
+            <wp:positionH relativeFrom="column">
+              <wp:posOffset>1525270</wp:posOffset>
+            </wp:positionH>
+            <wp:positionV relativeFrom="paragraph">
+              <wp:posOffset>356870</wp:posOffset>
+            </wp:positionV>
+            <wp:extent cx="2651760" cy="1490345"/>
+            <wp:effectExtent l="0" t="0" r="0" b="0"/>
+            <wp:wrapTopAndBottom/>
+            <wp:docPr id="1" name="Picture 1"/>
+            <wp:cNvGraphicFramePr>
+              <a:graphicFrameLocks xmlns:a="http://schemas.openxmlformats.org/drawingml/2006/main" noChangeAspect="1"/>
+            </wp:cNvGraphicFramePr>
+            <a:graphic xmlns:a="http://schemas.openxmlformats.org/drawingml/2006/main">
+              <a:graphicData uri="http://schemas.openxmlformats.org/drawingml/2006/picture">
+                <pic:pic xmlns:pic="http://schemas.openxmlformats.org/drawingml/2006/picture">
+                  <pic:nvPicPr>
+                    <pic:cNvPr id="0" name="232290711CThreadripper7000Series_4K.jpg"/>
+                    <pic:cNvPicPr/>
+                  </pic:nvPicPr>
+                  <pic:blipFill>
+                    <a:blip r:embed="rId16" cstate="print">
+                      <a:extLst>
+                        <a:ext uri="{28A0092B-C50C-407E-A947-70E740481C1C}">
+                          <a14:useLocalDpi xmlns:a14="http://schemas.microsoft.com/office/drawing/2010/main" val="0"/>
+                        </a:ext>
+                      </a:extLst>
+                    </a:blip>
+                    <a:stretch>
+                      <a:fillRect/>
+                    </a:stretch>
+                  </pic:blipFill>
+                  <pic:spPr>
+                    <a:xfrm>
+                      <a:off x="0" y="0"/>
+                      <a:ext cx="2651760" cy="1490345"/>
+                    </a:xfrm>
+                    <a:prstGeom prst="rect">
+                      <a:avLst/>
+                    </a:prstGeom>
+                  </pic:spPr>
+                </pic:pic>
+              </a:graphicData>
+            </a:graphic>
+            <wp14:sizeRelH relativeFrom="margin">
+              <wp14:pctWidth>0</wp14:pctWidth>
+            </wp14:sizeRelH>
+            <wp14:sizeRelV relativeFrom="margin">
+              <wp14:pctHeight>0</wp14:pctHeight>
+            </wp14:sizeRelV>
+          </wp:anchor>
+        </w:drawing>
+      </w:r>
+      <w:r>
+        <w:rPr>
+          <w:rFonts w:ascii="Times New Roman" w:hAnsi="Times New Roman" w:cs="Times New Roman"/>
+          <w:b/>
+          <w:sz w:val="24"/>
+          <w:szCs w:val="28"/>
+          <w:u w:val="single"/>
+        </w:rPr>
+        <w:t>High-core CPUs</w:t>
+      </w:r>
+    </w:p>
+    <w:p>
+      <w:pPr>
+        <w:pStyle w:val="ListParagraph"/>
+        <w:ind w:left="360"/>
+        <w:jc w:val="both"/>
+        <w:rPr>
+          <w:rFonts w:ascii="Times New Roman" w:hAnsi="Times New Roman" w:cs="Times New Roman"/>
+          <w:b/>
+          <w:sz w:val="28"/>
+          <w:szCs w:val="28"/>
+          <w:u w:val="single"/>
+        </w:rPr>
+      </w:pPr>
+    </w:p>
+    <w:p>
+      <w:pPr>
+        <w:ind w:left="360"/>
+        <w:jc w:val="both"/>
+        <w:rPr>
+          <w:rFonts w:ascii="Times New Roman" w:hAnsi="Times New Roman" w:cs="Times New Roman"/>
+          <w:sz w:val="24"/>
+          <w:szCs w:val="28"/>
+        </w:rPr>
+      </w:pPr>
+      <w:r>
+        <w:rPr>
+          <w:rFonts w:ascii="Times New Roman" w:hAnsi="Times New Roman" w:cs="Times New Roman"/>
+          <w:sz w:val="24"/>
+          <w:szCs w:val="28"/>
+        </w:rPr>
+        <w:t>High-core CPUs improves parallel processing and task scheduling during AI training.</w:t>
+      </w:r>
+      <w:r>
+        <w:rPr>
+          <w:rFonts w:ascii="Times New Roman" w:hAnsi="Times New Roman" w:cs="Times New Roman"/>
+          <w:sz w:val="24"/>
+          <w:szCs w:val="28"/>
+        </w:rPr>
+        <w:t xml:space="preserve"> </w:t>
+      </w:r>
+      <w:r>
+        <w:rPr>
+          <w:rFonts w:ascii="Times New Roman" w:hAnsi="Times New Roman" w:cs="Times New Roman"/>
+          <w:sz w:val="24"/>
+          <w:szCs w:val="28"/>
+        </w:rPr>
+        <w:t xml:space="preserve">GPUs with thousands CUDA cored perform </w:t>
+      </w:r>
+      <w:r>
+        <w:rPr>
+          <w:rFonts w:ascii="Times New Roman" w:hAnsi="Times New Roman" w:cs="Times New Roman"/>
+          <w:sz w:val="24"/>
+          <w:szCs w:val="28"/>
+        </w:rPr>
+        <w:t>large matrix and vector operations required in neural networks, which significantly reduces training and inference time.</w:t>
+      </w:r>
+    </w:p>
+    <w:p>
+      <w:pPr>
+        <w:pStyle w:val="ListParagraph"/>
+        <w:numPr>
+          <w:ilvl w:val="0"/>
+          <w:numId w:val="8"/>
+        </w:numPr>
+        <w:jc w:val="both"/>
+        <w:rPr>
+          <w:rFonts w:ascii="Times New Roman" w:hAnsi="Times New Roman" w:cs="Times New Roman"/>
+          <w:b/>
+          <w:bCs/>
+          <w:sz w:val="24"/>
+          <w:szCs w:val="28"/>
+          <w:u w:val="single"/>
+        </w:rPr>
+      </w:pPr>
+      <w:r>
+        <w:rPr>
+          <w:rFonts w:ascii="Times New Roman" w:hAnsi="Times New Roman" w:cs="Times New Roman"/>
+          <w:b/>
+          <w:bCs/>
+          <w:sz w:val="24"/>
+          <w:szCs w:val="28"/>
+          <w:u w:val="single"/>
+        </w:rPr>
+        <w:t>High-Capacity RAM</w:t>
+      </w:r>
+    </w:p>
+    <w:p>
+      <w:pPr>
+        <w:pStyle w:val="ListParagraph"/>
+        <w:ind w:left="360"/>
+        <w:jc w:val="both"/>
+        <w:rPr>
+          <w:rFonts w:ascii="Times New Roman" w:hAnsi="Times New Roman" w:cs="Times New Roman"/>
+          <w:b/>
+          <w:bCs/>
+          <w:sz w:val="24"/>
+          <w:szCs w:val="28"/>
+          <w:u w:val="single"/>
+        </w:rPr>
+      </w:pPr>
+      <w:r>
+        <w:rPr>
+          <w:rFonts w:ascii="Times New Roman" w:hAnsi="Times New Roman" w:cs="Times New Roman"/>
+          <w:b/>
+          <w:bCs/>
+          <w:noProof/>
+          <w:sz w:val="24"/>
+          <w:szCs w:val="28"/>
+          <w:u w:val="single"/>
+        </w:rPr>
+        <w:drawing>
+          <wp:anchor distT="0" distB="0" distL="114300" distR="114300" simplePos="0" relativeHeight="251663360" behindDoc="1" locked="0" layoutInCell="1" allowOverlap="1" wp14:anchorId="358D1820" wp14:editId="1EFCB765">
+            <wp:simplePos x="0" y="0"/>
+            <wp:positionH relativeFrom="column">
+              <wp:posOffset>1761600</wp:posOffset>
+            </wp:positionH>
+            <wp:positionV relativeFrom="paragraph">
+              <wp:posOffset>123163</wp:posOffset>
+            </wp:positionV>
+            <wp:extent cx="2416810" cy="1449070"/>
+            <wp:effectExtent l="0" t="0" r="2540" b="0"/>
+            <wp:wrapTight wrapText="bothSides">
+              <wp:wrapPolygon edited="0">
+                <wp:start x="0" y="0"/>
+                <wp:lineTo x="0" y="21297"/>
+                <wp:lineTo x="21452" y="21297"/>
+                <wp:lineTo x="21452" y="0"/>
+                <wp:lineTo x="0" y="0"/>
+              </wp:wrapPolygon>
+            </wp:wrapTight>
+            <wp:docPr id="852304600" name="Picture 1"/>
+            <wp:cNvGraphicFramePr>
+              <a:graphicFrameLocks xmlns:a="http://schemas.openxmlformats.org/drawingml/2006/main" noChangeAspect="1"/>
+            </wp:cNvGraphicFramePr>
+            <a:graphic xmlns:a="http://schemas.openxmlformats.org/drawingml/2006/main">
+              <a:graphicData uri="http://schemas.openxmlformats.org/drawingml/2006/picture">
+                <pic:pic xmlns:pic="http://schemas.openxmlformats.org/drawingml/2006/picture">
+                  <pic:nvPicPr>
+                    <pic:cNvPr id="852304600" name="Picture 852304600"/>
+                    <pic:cNvPicPr/>
+                  </pic:nvPicPr>
+                  <pic:blipFill>
+                    <a:blip r:embed="rId17" cstate="print">
+                      <a:extLst>
+                        <a:ext uri="{28A0092B-C50C-407E-A947-70E740481C1C}">
+                          <a14:useLocalDpi xmlns:a14="http://schemas.microsoft.com/office/drawing/2010/main" val="0"/>
+                        </a:ext>
+                      </a:extLst>
+                    </a:blip>
+                    <a:stretch>
+                      <a:fillRect/>
+                    </a:stretch>
+                  </pic:blipFill>
+                  <pic:spPr>
+                    <a:xfrm>
+                      <a:off x="0" y="0"/>
+                      <a:ext cx="2416810" cy="1449070"/>
+                    </a:xfrm>
+                    <a:prstGeom prst="rect">
+                      <a:avLst/>
+                    </a:prstGeom>
+                  </pic:spPr>
+                </pic:pic>
+              </a:graphicData>
+            </a:graphic>
+            <wp14:sizeRelH relativeFrom="margin">
+              <wp14:pctWidth>0</wp14:pctWidth>
+            </wp14:sizeRelH>
+            <wp14:sizeRelV relativeFrom="margin">
+              <wp14:pctHeight>0</wp14:pctHeight>
+            </wp14:sizeRelV>
+          </wp:anchor>
+        </w:drawing>
+      </w:r>
+    </w:p>
+    <w:p>
+      <w:pPr>
+        <w:pStyle w:val="ListParagraph"/>
+        <w:ind w:left="360"/>
+        <w:jc w:val="both"/>
+        <w:rPr>
+          <w:rFonts w:ascii="Times New Roman" w:hAnsi="Times New Roman" w:cs="Times New Roman"/>
+          <w:sz w:val="24"/>
+          <w:szCs w:val="28"/>
+        </w:rPr>
+      </w:pPr>
+    </w:p>
+    <w:p>
+      <w:pPr>
+        <w:pStyle w:val="ListParagraph"/>
+        <w:ind w:left="360"/>
+        <w:jc w:val="both"/>
+        <w:rPr>
+          <w:rFonts w:ascii="Times New Roman" w:hAnsi="Times New Roman" w:cs="Times New Roman"/>
+          <w:sz w:val="24"/>
+          <w:szCs w:val="28"/>
+        </w:rPr>
+      </w:pPr>
+    </w:p>
+    <w:p>
+      <w:pPr>
+        <w:pStyle w:val="ListParagraph"/>
+        <w:ind w:left="360"/>
+        <w:jc w:val="both"/>
+        <w:rPr>
+          <w:rFonts w:ascii="Times New Roman" w:hAnsi="Times New Roman" w:cs="Times New Roman"/>
+          <w:sz w:val="24"/>
+          <w:szCs w:val="28"/>
+        </w:rPr>
+      </w:pPr>
+    </w:p>
+    <w:p>
+      <w:pPr>
+        <w:pStyle w:val="ListParagraph"/>
+        <w:ind w:left="360"/>
+        <w:jc w:val="both"/>
+        <w:rPr>
+          <w:rFonts w:ascii="Times New Roman" w:hAnsi="Times New Roman" w:cs="Times New Roman"/>
+          <w:sz w:val="24"/>
+          <w:szCs w:val="28"/>
+        </w:rPr>
+      </w:pPr>
+      <w:r>
+        <w:rPr>
+          <w:rFonts w:ascii="Times New Roman" w:hAnsi="Times New Roman" w:cs="Times New Roman"/>
+          <w:sz w:val="24"/>
+          <w:szCs w:val="28"/>
+        </w:rPr>
+        <w:lastRenderedPageBreak/>
+        <w:t xml:space="preserve">Allows large datasets and intermediate model data to be stored in memory without frequent disk access. Large GPU memory enables training of bigger batch sizes. </w:t>
+      </w:r>
+    </w:p>
+    <w:p>
+      <w:pPr>
+        <w:pStyle w:val="ListParagraph"/>
+        <w:ind w:left="360"/>
+        <w:jc w:val="both"/>
+        <w:rPr>
+          <w:rFonts w:ascii="Times New Roman" w:hAnsi="Times New Roman" w:cs="Times New Roman"/>
+          <w:sz w:val="24"/>
+          <w:szCs w:val="28"/>
+        </w:rPr>
+      </w:pPr>
+    </w:p>
+    <w:p>
+      <w:pPr>
+        <w:pStyle w:val="ListParagraph"/>
+        <w:ind w:left="360"/>
+        <w:jc w:val="both"/>
+        <w:rPr>
+          <w:rFonts w:ascii="Times New Roman" w:hAnsi="Times New Roman" w:cs="Times New Roman"/>
+          <w:b/>
+          <w:bCs/>
+          <w:sz w:val="28"/>
+          <w:szCs w:val="32"/>
+          <w:u w:val="single"/>
+        </w:rPr>
+      </w:pPr>
+      <w:r>
+        <w:rPr>
+          <w:rFonts w:ascii="Times New Roman" w:hAnsi="Times New Roman" w:cs="Times New Roman"/>
+          <w:b/>
+          <w:bCs/>
+          <w:sz w:val="28"/>
+          <w:szCs w:val="32"/>
+          <w:u w:val="single"/>
+        </w:rPr>
+        <w:t>NVMe SSD</w:t>
+      </w:r>
+    </w:p>
+    <w:p>
+      <w:pPr>
+        <w:pStyle w:val="ListParagraph"/>
+        <w:ind w:left="360"/>
+        <w:jc w:val="both"/>
+        <w:rPr>
+          <w:rFonts w:ascii="Times New Roman" w:hAnsi="Times New Roman" w:cs="Times New Roman"/>
+          <w:sz w:val="24"/>
+          <w:szCs w:val="28"/>
+        </w:rPr>
+      </w:pPr>
+    </w:p>
+    <w:p>
+      <w:pPr>
+        <w:pStyle w:val="ListParagraph"/>
+        <w:ind w:left="360"/>
+        <w:jc w:val="both"/>
+        <w:rPr>
+          <w:rFonts w:ascii="Times New Roman" w:hAnsi="Times New Roman" w:cs="Times New Roman"/>
+          <w:sz w:val="24"/>
+          <w:szCs w:val="28"/>
+        </w:rPr>
+      </w:pPr>
+    </w:p>
+    <w:p>
+      <w:pPr>
+        <w:pStyle w:val="ListParagraph"/>
+        <w:ind w:left="360"/>
+        <w:jc w:val="both"/>
+        <w:rPr>
+          <w:rFonts w:ascii="Times New Roman" w:hAnsi="Times New Roman" w:cs="Times New Roman"/>
+          <w:sz w:val="24"/>
+          <w:szCs w:val="28"/>
+        </w:rPr>
+      </w:pPr>
+    </w:p>
+    <w:p>
+      <w:pPr>
+        <w:pStyle w:val="ListParagraph"/>
+        <w:ind w:left="360"/>
+        <w:jc w:val="both"/>
+        <w:rPr>
+          <w:rFonts w:ascii="Times New Roman" w:hAnsi="Times New Roman" w:cs="Times New Roman"/>
+          <w:sz w:val="24"/>
+          <w:szCs w:val="28"/>
+        </w:rPr>
+      </w:pPr>
+    </w:p>
+    <w:p>
+      <w:pPr>
+        <w:pStyle w:val="ListParagraph"/>
+        <w:ind w:left="360"/>
+        <w:jc w:val="both"/>
+        <w:rPr>
+          <w:rFonts w:ascii="Times New Roman" w:hAnsi="Times New Roman" w:cs="Times New Roman"/>
+          <w:sz w:val="24"/>
+          <w:szCs w:val="28"/>
+        </w:rPr>
+      </w:pPr>
+    </w:p>
     <w:sectPr>
       <w:pgSz w:w="12240" w:h="15840"/>
       <w:pgMar w:top="1440" w:right="1440" w:bottom="1440" w:left="1440" w:header="720" w:footer="720" w:gutter="0"/>
@@ -1581,6 +3804,232 @@
 <file path=word/numbering.xml><?xml version="1.0" encoding="utf-8"?>
 <w:numbering xmlns:wpc="http://schemas.microsoft.com/office/word/2010/wordprocessingCanvas" xmlns:cx="http://schemas.microsoft.com/office/drawing/2014/chartex" xmlns:cx1="http://schemas.microsoft.com/office/drawing/2015/9/8/chartex" xmlns:cx2="http://schemas.microsoft.com/office/drawing/2015/10/21/chartex" xmlns:cx3="http://schemas.microsoft.com/office/drawing/2016/5/9/chartex" xmlns:cx4="http://schemas.microsoft.com/office/drawing/2016/5/10/chartex" xmlns:cx5="http://schemas.microsoft.com/office/drawing/2016/5/11/chartex" xmlns:cx6="http://schemas.microsoft.com/office/drawing/2016/5/12/chartex" xmlns:cx7="http://schemas.microsoft.com/office/drawing/2016/5/13/chartex" xmlns:cx8="http://schemas.microsoft.com/office/drawing/2016/5/14/chartex" xmlns:mc="http://schemas.openxmlformats.org/markup-compatibility/2006" xmlns:aink="http://schemas.microsoft.com/office/drawing/2016/ink" xmlns:am3d="http://schemas.microsoft.com/office/drawing/2017/model3d" xmlns:o="urn:schemas-microsoft-com:office:office" xmlns:oel="http://schemas.microsoft.com/office/2019/extlst" xmlns:r="http://schemas.openxmlformats.org/officeDocument/2006/relationships" xmlns:m="http://schemas.openxmlformats.org/officeDocument/2006/math" xmlns:v="urn:schemas-microsoft-com:vml" xmlns:wp14="http://schemas.microsoft.com/office/word/2010/wordprocessingDrawing" xmlns:wp="http://schemas.openxmlformats.org/drawingml/2006/wordprocessingDrawing" xmlns:w10="urn:schemas-microsoft-com:office:word" xmlns:w="http://schemas.openxmlformats.org/wordprocessingml/2006/main" xmlns:w14="http://schemas.microsoft.com/office/word/2010/wordml" xmlns:w15="http://schemas.microsoft.com/office/word/2012/wordml" xmlns:w16cex="http://schemas.microsoft.com/office/word/2018/wordml/cex" xmlns:w16cid="http://schemas.microsoft.com/office/word/2016/wordml/cid" xmlns:w16="http://schemas.microsoft.com/office/word/2018/wordml" xmlns:w16du="http://schemas.microsoft.com/office/word/2023/wordml/word16du" xmlns:w16sdtdh="http://schemas.microsoft.com/office/word/2020/wordml/sdtdatahash" xmlns:w16se="http://schemas.microsoft.com/office/word/2015/wordml/symex" xmlns:wpg="http://schemas.microsoft.com/office/word/2010/wordprocessingGroup" xmlns:wpi="http://schemas.microsoft.com/office/word/2010/wordprocessingInk" xmlns:wne="http://schemas.microsoft.com/office/word/2006/wordml" xmlns:wps="http://schemas.microsoft.com/office/word/2010/wordprocessingShape" mc:Ignorable="w14 w15 w16se w16cid w16 w16cex w16sdtdh w16du wp14">
   <w:abstractNum w:abstractNumId="0" w15:restartNumberingAfterBreak="0">
+    <w:nsid w:val="02E10E44"/>
+    <w:multiLevelType w:val="hybridMultilevel"/>
+    <w:tmpl w:val="06E4B8CC"/>
+    <w:lvl w:ilvl="0" w:tplc="04090001">
+      <w:start w:val="1"/>
+      <w:numFmt w:val="bullet"/>
+      <w:lvlText w:val=""/>
+      <w:lvlJc w:val="left"/>
+      <w:pPr>
+        <w:ind w:left="720" w:hanging="360"/>
+      </w:pPr>
+      <w:rPr>
+        <w:rFonts w:ascii="Symbol" w:hAnsi="Symbol" w:hint="default"/>
+      </w:rPr>
+    </w:lvl>
+    <w:lvl w:ilvl="1" w:tplc="04090003" w:tentative="1">
+      <w:start w:val="1"/>
+      <w:numFmt w:val="bullet"/>
+      <w:lvlText w:val="o"/>
+      <w:lvlJc w:val="left"/>
+      <w:pPr>
+        <w:ind w:left="1440" w:hanging="360"/>
+      </w:pPr>
+      <w:rPr>
+        <w:rFonts w:ascii="Courier New" w:hAnsi="Courier New" w:cs="Courier New" w:hint="default"/>
+      </w:rPr>
+    </w:lvl>
+    <w:lvl w:ilvl="2" w:tplc="04090005" w:tentative="1">
+      <w:start w:val="1"/>
+      <w:numFmt w:val="bullet"/>
+      <w:lvlText w:val=""/>
+      <w:lvlJc w:val="left"/>
+      <w:pPr>
+        <w:ind w:left="2160" w:hanging="360"/>
+      </w:pPr>
+      <w:rPr>
+        <w:rFonts w:ascii="Wingdings" w:hAnsi="Wingdings" w:hint="default"/>
+      </w:rPr>
+    </w:lvl>
+    <w:lvl w:ilvl="3" w:tplc="04090001" w:tentative="1">
+      <w:start w:val="1"/>
+      <w:numFmt w:val="bullet"/>
+      <w:lvlText w:val=""/>
+      <w:lvlJc w:val="left"/>
+      <w:pPr>
+        <w:ind w:left="2880" w:hanging="360"/>
+      </w:pPr>
+      <w:rPr>
+        <w:rFonts w:ascii="Symbol" w:hAnsi="Symbol" w:hint="default"/>
+      </w:rPr>
+    </w:lvl>
+    <w:lvl w:ilvl="4" w:tplc="04090003" w:tentative="1">
+      <w:start w:val="1"/>
+      <w:numFmt w:val="bullet"/>
+      <w:lvlText w:val="o"/>
+      <w:lvlJc w:val="left"/>
+      <w:pPr>
+        <w:ind w:left="3600" w:hanging="360"/>
+      </w:pPr>
+      <w:rPr>
+        <w:rFonts w:ascii="Courier New" w:hAnsi="Courier New" w:cs="Courier New" w:hint="default"/>
+      </w:rPr>
+    </w:lvl>
+    <w:lvl w:ilvl="5" w:tplc="04090005" w:tentative="1">
+      <w:start w:val="1"/>
+      <w:numFmt w:val="bullet"/>
+      <w:lvlText w:val=""/>
+      <w:lvlJc w:val="left"/>
+      <w:pPr>
+        <w:ind w:left="4320" w:hanging="360"/>
+      </w:pPr>
+      <w:rPr>
+        <w:rFonts w:ascii="Wingdings" w:hAnsi="Wingdings" w:hint="default"/>
+      </w:rPr>
+    </w:lvl>
+    <w:lvl w:ilvl="6" w:tplc="04090001" w:tentative="1">
+      <w:start w:val="1"/>
+      <w:numFmt w:val="bullet"/>
+      <w:lvlText w:val=""/>
+      <w:lvlJc w:val="left"/>
+      <w:pPr>
+        <w:ind w:left="5040" w:hanging="360"/>
+      </w:pPr>
+      <w:rPr>
+        <w:rFonts w:ascii="Symbol" w:hAnsi="Symbol" w:hint="default"/>
+      </w:rPr>
+    </w:lvl>
+    <w:lvl w:ilvl="7" w:tplc="04090003" w:tentative="1">
+      <w:start w:val="1"/>
+      <w:numFmt w:val="bullet"/>
+      <w:lvlText w:val="o"/>
+      <w:lvlJc w:val="left"/>
+      <w:pPr>
+        <w:ind w:left="5760" w:hanging="360"/>
+      </w:pPr>
+      <w:rPr>
+        <w:rFonts w:ascii="Courier New" w:hAnsi="Courier New" w:cs="Courier New" w:hint="default"/>
+      </w:rPr>
+    </w:lvl>
+    <w:lvl w:ilvl="8" w:tplc="04090005" w:tentative="1">
+      <w:start w:val="1"/>
+      <w:numFmt w:val="bullet"/>
+      <w:lvlText w:val=""/>
+      <w:lvlJc w:val="left"/>
+      <w:pPr>
+        <w:ind w:left="6480" w:hanging="360"/>
+      </w:pPr>
+      <w:rPr>
+        <w:rFonts w:ascii="Wingdings" w:hAnsi="Wingdings" w:hint="default"/>
+      </w:rPr>
+    </w:lvl>
+  </w:abstractNum>
+  <w:abstractNum w:abstractNumId="1" w15:restartNumberingAfterBreak="0">
+    <w:nsid w:val="174C7756"/>
+    <w:multiLevelType w:val="hybridMultilevel"/>
+    <w:tmpl w:val="EA6609CC"/>
+    <w:lvl w:ilvl="0" w:tplc="04090001">
+      <w:start w:val="1"/>
+      <w:numFmt w:val="bullet"/>
+      <w:lvlText w:val=""/>
+      <w:lvlJc w:val="left"/>
+      <w:pPr>
+        <w:ind w:left="720" w:hanging="360"/>
+      </w:pPr>
+      <w:rPr>
+        <w:rFonts w:ascii="Symbol" w:hAnsi="Symbol" w:hint="default"/>
+      </w:rPr>
+    </w:lvl>
+    <w:lvl w:ilvl="1" w:tplc="04090003" w:tentative="1">
+      <w:start w:val="1"/>
+      <w:numFmt w:val="bullet"/>
+      <w:lvlText w:val="o"/>
+      <w:lvlJc w:val="left"/>
+      <w:pPr>
+        <w:ind w:left="1440" w:hanging="360"/>
+      </w:pPr>
+      <w:rPr>
+        <w:rFonts w:ascii="Courier New" w:hAnsi="Courier New" w:cs="Courier New" w:hint="default"/>
+      </w:rPr>
+    </w:lvl>
+    <w:lvl w:ilvl="2" w:tplc="04090005" w:tentative="1">
+      <w:start w:val="1"/>
+      <w:numFmt w:val="bullet"/>
+      <w:lvlText w:val=""/>
+      <w:lvlJc w:val="left"/>
+      <w:pPr>
+        <w:ind w:left="2160" w:hanging="360"/>
+      </w:pPr>
+      <w:rPr>
+        <w:rFonts w:ascii="Wingdings" w:hAnsi="Wingdings" w:hint="default"/>
+      </w:rPr>
+    </w:lvl>
+    <w:lvl w:ilvl="3" w:tplc="04090001" w:tentative="1">
+      <w:start w:val="1"/>
+      <w:numFmt w:val="bullet"/>
+      <w:lvlText w:val=""/>
+      <w:lvlJc w:val="left"/>
+      <w:pPr>
+        <w:ind w:left="2880" w:hanging="360"/>
+      </w:pPr>
+      <w:rPr>
+        <w:rFonts w:ascii="Symbol" w:hAnsi="Symbol" w:hint="default"/>
+      </w:rPr>
+    </w:lvl>
+    <w:lvl w:ilvl="4" w:tplc="04090003" w:tentative="1">
+      <w:start w:val="1"/>
+      <w:numFmt w:val="bullet"/>
+      <w:lvlText w:val="o"/>
+      <w:lvlJc w:val="left"/>
+      <w:pPr>
+        <w:ind w:left="3600" w:hanging="360"/>
+      </w:pPr>
+      <w:rPr>
+        <w:rFonts w:ascii="Courier New" w:hAnsi="Courier New" w:cs="Courier New" w:hint="default"/>
+      </w:rPr>
+    </w:lvl>
+    <w:lvl w:ilvl="5" w:tplc="04090005" w:tentative="1">
+      <w:start w:val="1"/>
+      <w:numFmt w:val="bullet"/>
+      <w:lvlText w:val=""/>
+      <w:lvlJc w:val="left"/>
+      <w:pPr>
+        <w:ind w:left="4320" w:hanging="360"/>
+      </w:pPr>
+      <w:rPr>
+        <w:rFonts w:ascii="Wingdings" w:hAnsi="Wingdings" w:hint="default"/>
+      </w:rPr>
+    </w:lvl>
+    <w:lvl w:ilvl="6" w:tplc="04090001" w:tentative="1">
+      <w:start w:val="1"/>
+      <w:numFmt w:val="bullet"/>
+      <w:lvlText w:val=""/>
+      <w:lvlJc w:val="left"/>
+      <w:pPr>
+        <w:ind w:left="5040" w:hanging="360"/>
+      </w:pPr>
+      <w:rPr>
+        <w:rFonts w:ascii="Symbol" w:hAnsi="Symbol" w:hint="default"/>
+      </w:rPr>
+    </w:lvl>
+    <w:lvl w:ilvl="7" w:tplc="04090003" w:tentative="1">
+      <w:start w:val="1"/>
+      <w:numFmt w:val="bullet"/>
+      <w:lvlText w:val="o"/>
+      <w:lvlJc w:val="left"/>
+      <w:pPr>
+        <w:ind w:left="5760" w:hanging="360"/>
+      </w:pPr>
+      <w:rPr>
+        <w:rFonts w:ascii="Courier New" w:hAnsi="Courier New" w:cs="Courier New" w:hint="default"/>
+      </w:rPr>
+    </w:lvl>
+    <w:lvl w:ilvl="8" w:tplc="04090005" w:tentative="1">
+      <w:start w:val="1"/>
+      <w:numFmt w:val="bullet"/>
+      <w:lvlText w:val=""/>
+      <w:lvlJc w:val="left"/>
+      <w:pPr>
+        <w:ind w:left="6480" w:hanging="360"/>
+      </w:pPr>
+      <w:rPr>
+        <w:rFonts w:ascii="Wingdings" w:hAnsi="Wingdings" w:hint="default"/>
+      </w:rPr>
+    </w:lvl>
+  </w:abstractNum>
+  <w:abstractNum w:abstractNumId="2" w15:restartNumberingAfterBreak="0">
     <w:nsid w:val="216A2794"/>
     <w:multiLevelType w:val="hybridMultilevel"/>
     <w:tmpl w:val="33FA4AE4"/>
@@ -1666,7 +4115,7 @@
       </w:pPr>
     </w:lvl>
   </w:abstractNum>
-  <w:abstractNum w:abstractNumId="1" w15:restartNumberingAfterBreak="0">
+  <w:abstractNum w:abstractNumId="3" w15:restartNumberingAfterBreak="0">
     <w:nsid w:val="25FC7347"/>
     <w:multiLevelType w:val="hybridMultilevel"/>
     <w:tmpl w:val="4B068000"/>
@@ -1779,7 +4228,93 @@
       </w:rPr>
     </w:lvl>
   </w:abstractNum>
-  <w:abstractNum w:abstractNumId="2" w15:restartNumberingAfterBreak="0">
+  <w:abstractNum w:abstractNumId="4" w15:restartNumberingAfterBreak="0">
+    <w:nsid w:val="32A10CD0"/>
+    <w:multiLevelType w:val="multilevel"/>
+    <w:tmpl w:val="0409001F"/>
+    <w:lvl w:ilvl="0">
+      <w:start w:val="1"/>
+      <w:numFmt w:val="decimal"/>
+      <w:lvlText w:val="%1."/>
+      <w:lvlJc w:val="left"/>
+      <w:pPr>
+        <w:ind w:left="360" w:hanging="360"/>
+      </w:pPr>
+    </w:lvl>
+    <w:lvl w:ilvl="1">
+      <w:start w:val="1"/>
+      <w:numFmt w:val="decimal"/>
+      <w:lvlText w:val="%1.%2."/>
+      <w:lvlJc w:val="left"/>
+      <w:pPr>
+        <w:ind w:left="792" w:hanging="432"/>
+      </w:pPr>
+    </w:lvl>
+    <w:lvl w:ilvl="2">
+      <w:start w:val="1"/>
+      <w:numFmt w:val="decimal"/>
+      <w:lvlText w:val="%1.%2.%3."/>
+      <w:lvlJc w:val="left"/>
+      <w:pPr>
+        <w:ind w:left="1224" w:hanging="504"/>
+      </w:pPr>
+    </w:lvl>
+    <w:lvl w:ilvl="3">
+      <w:start w:val="1"/>
+      <w:numFmt w:val="decimal"/>
+      <w:lvlText w:val="%1.%2.%3.%4."/>
+      <w:lvlJc w:val="left"/>
+      <w:pPr>
+        <w:ind w:left="1728" w:hanging="648"/>
+      </w:pPr>
+    </w:lvl>
+    <w:lvl w:ilvl="4">
+      <w:start w:val="1"/>
+      <w:numFmt w:val="decimal"/>
+      <w:lvlText w:val="%1.%2.%3.%4.%5."/>
+      <w:lvlJc w:val="left"/>
+      <w:pPr>
+        <w:ind w:left="2232" w:hanging="792"/>
+      </w:pPr>
+    </w:lvl>
+    <w:lvl w:ilvl="5">
+      <w:start w:val="1"/>
+      <w:numFmt w:val="decimal"/>
+      <w:lvlText w:val="%1.%2.%3.%4.%5.%6."/>
+      <w:lvlJc w:val="left"/>
+      <w:pPr>
+        <w:ind w:left="2736" w:hanging="936"/>
+      </w:pPr>
+    </w:lvl>
+    <w:lvl w:ilvl="6">
+      <w:start w:val="1"/>
+      <w:numFmt w:val="decimal"/>
+      <w:lvlText w:val="%1.%2.%3.%4.%5.%6.%7."/>
+      <w:lvlJc w:val="left"/>
+      <w:pPr>
+        <w:ind w:left="3240" w:hanging="1080"/>
+      </w:pPr>
+    </w:lvl>
+    <w:lvl w:ilvl="7">
+      <w:start w:val="1"/>
+      <w:numFmt w:val="decimal"/>
+      <w:lvlText w:val="%1.%2.%3.%4.%5.%6.%7.%8."/>
+      <w:lvlJc w:val="left"/>
+      <w:pPr>
+        <w:ind w:left="3744" w:hanging="1224"/>
+      </w:pPr>
+    </w:lvl>
+    <w:lvl w:ilvl="8">
+      <w:start w:val="1"/>
+      <w:numFmt w:val="decimal"/>
+      <w:lvlText w:val="%1.%2.%3.%4.%5.%6.%7.%8.%9."/>
+      <w:lvlJc w:val="left"/>
+      <w:pPr>
+        <w:ind w:left="4320" w:hanging="1440"/>
+      </w:pPr>
+    </w:lvl>
+  </w:abstractNum>
+  <w:abstractNum w:abstractNumId="5" w15:restartNumberingAfterBreak="0">
     <w:nsid w:val="32F1033A"/>
     <w:multiLevelType w:val="hybridMultilevel"/>
     <w:tmpl w:val="8518930A"/>
@@ -1865,7 +4400,97 @@
       </w:pPr>
     </w:lvl>
   </w:abstractNum>
-  <w:abstractNum w:abstractNumId="3" w15:restartNumberingAfterBreak="0">
+  <w:abstractNum w:abstractNumId="6" w15:restartNumberingAfterBreak="0">
+    <w:nsid w:val="5317621D"/>
+    <w:multiLevelType w:val="multilevel"/>
+    <w:tmpl w:val="93C436D4"/>
+    <w:lvl w:ilvl="0">
+      <w:start w:val="1"/>
+      <w:numFmt w:val="decimal"/>
+      <w:lvlText w:val="%1."/>
+      <w:lvlJc w:val="left"/>
+      <w:pPr>
+        <w:ind w:left="360" w:hanging="360"/>
+      </w:pPr>
+      <w:rPr>
+        <w:b/>
+        <w:bCs/>
+      </w:rPr>
+    </w:lvl>
+    <w:lvl w:ilvl="1">
+      <w:start w:val="1"/>
+      <w:numFmt w:val="decimal"/>
+      <w:lvlText w:val="%1.%2."/>
+      <w:lvlJc w:val="left"/>
+      <w:pPr>
+        <w:ind w:left="792" w:hanging="432"/>
+      </w:pPr>
+    </w:lvl>
+    <w:lvl w:ilvl="2">
+      <w:start w:val="1"/>
+      <w:numFmt w:val="decimal"/>
+      <w:lvlText w:val="%1.%2.%3."/>
+      <w:lvlJc w:val="left"/>
+      <w:pPr>
+        <w:ind w:left="1224" w:hanging="504"/>
+      </w:pPr>
+    </w:lvl>
+    <w:lvl w:ilvl="3">
+      <w:start w:val="1"/>
+      <w:numFmt w:val="decimal"/>
+      <w:lvlText w:val="%1.%2.%3.%4."/>
+      <w:lvlJc w:val="left"/>
+      <w:pPr>
+        <w:ind w:left="1728" w:hanging="648"/>
+      </w:pPr>
+    </w:lvl>
+    <w:lvl w:ilvl="4">
+      <w:start w:val="1"/>
+      <w:numFmt w:val="decimal"/>
+      <w:lvlText w:val="%1.%2.%3.%4.%5."/>
+      <w:lvlJc w:val="left"/>
+      <w:pPr>
+        <w:ind w:left="2232" w:hanging="792"/>
+      </w:pPr>
+    </w:lvl>
+    <w:lvl w:ilvl="5">
+      <w:start w:val="1"/>
+      <w:numFmt w:val="decimal"/>
+      <w:lvlText w:val="%1.%2.%3.%4.%5.%6."/>
+      <w:lvlJc w:val="left"/>
+      <w:pPr>
+        <w:ind w:left="2736" w:hanging="936"/>
+      </w:pPr>
+    </w:lvl>
+    <w:lvl w:ilvl="6">
+      <w:start w:val="1"/>
+      <w:numFmt w:val="decimal"/>
+      <w:lvlText w:val="%1.%2.%3.%4.%5.%6.%7."/>
+      <w:lvlJc w:val="left"/>
+      <w:pPr>
+        <w:ind w:left="3240" w:hanging="1080"/>
+      </w:pPr>
+    </w:lvl>
+    <w:lvl w:ilvl="7">
+      <w:start w:val="1"/>
+      <w:numFmt w:val="decimal"/>
+      <w:lvlText w:val="%1.%2.%3.%4.%5.%6.%7.%8."/>
+      <w:lvlJc w:val="left"/>
+      <w:pPr>
+        <w:ind w:left="3744" w:hanging="1224"/>
+      </w:pPr>
+    </w:lvl>
+    <w:lvl w:ilvl="8">
+      <w:start w:val="1"/>
+      <w:numFmt w:val="decimal"/>
+      <w:lvlText w:val="%1.%2.%3.%4.%5.%6.%7.%8.%9."/>
+      <w:lvlJc w:val="left"/>
+      <w:pPr>
+        <w:ind w:left="4320" w:hanging="1440"/>
+      </w:pPr>
+    </w:lvl>
+  </w:abstractNum>
+  <w:abstractNum w:abstractNumId="7" w15:restartNumberingAfterBreak="0">
     <w:nsid w:val="7BEB28A7"/>
     <w:multiLevelType w:val="hybridMultilevel"/>
     <w:tmpl w:val="8B5EF57A"/>
@@ -1951,17 +4576,29 @@
       </w:pPr>
     </w:lvl>
   </w:abstractNum>
-  <w:num w:numId="1" w16cid:durableId="478418986">
+  <w:num w:numId="1" w16cid:durableId="1300114645">
+    <w:abstractNumId w:val="5"/>
+  </w:num>
+  <w:num w:numId="2" w16cid:durableId="1019038994">
+    <w:abstractNumId w:val="3"/>
+  </w:num>
+  <w:num w:numId="3" w16cid:durableId="1405685795">
     <w:abstractNumId w:val="2"/>
   </w:num>
-  <w:num w:numId="2" w16cid:durableId="1342855851">
+  <w:num w:numId="4" w16cid:durableId="1655375419">
+    <w:abstractNumId w:val="7"/>
+  </w:num>
+  <w:num w:numId="5" w16cid:durableId="1131753584">
+    <w:abstractNumId w:val="0"/>
+  </w:num>
+  <w:num w:numId="6" w16cid:durableId="1856767630">
+    <w:abstractNumId w:val="4"/>
+  </w:num>
+  <w:num w:numId="7" w16cid:durableId="1458257904">
     <w:abstractNumId w:val="1"/>
   </w:num>
-  <w:num w:numId="3" w16cid:durableId="1925868825">
-    <w:abstractNumId w:val="0"/>
-  </w:num>
-  <w:num w:numId="4" w16cid:durableId="377700889">
-    <w:abstractNumId w:val="3"/>
+  <w:num w:numId="8" w16cid:durableId="473646337">
+    <w:abstractNumId w:val="6"/>
   </w:num>
 </w:numbering>
 </file>
@@ -2366,6 +5003,7 @@
   <w:style w:type="paragraph" w:default="1" w:styleId="Normal">
     <w:name w:val="Normal"/>
     <w:qFormat/>
+    <w:rsid w:val="00CE20CF"/>
   </w:style>
   <w:style w:type="paragraph" w:styleId="Heading1">
     <w:name w:val="heading 1"/>
@@ -2391,6 +5029,7 @@
   <w:style w:type="character" w:default="1" w:styleId="DefaultParagraphFont">
     <w:name w:val="Default Paragraph Font"/>
     <w:uiPriority w:val="1"/>
+    <w:semiHidden/>
     <w:unhideWhenUsed/>
   </w:style>
   <w:style w:type="table" w:default="1" w:styleId="TableNormal">
@@ -2502,6 +5141,151 @@
       <w:rFonts w:eastAsiaTheme="minorEastAsia"/>
       <w:color w:val="5A5A5A" w:themeColor="text1" w:themeTint="A5"/>
       <w:spacing w:val="15"/>
+    </w:rPr>
+  </w:style>
+  <w:style w:type="table" w:styleId="TableGrid">
+    <w:name w:val="Table Grid"/>
+    <w:basedOn w:val="TableNormal"/>
+    <w:uiPriority w:val="59"/>
+    <w:rsid w:val="00EF0D1A"/>
+    <w:pPr>
+      <w:spacing w:after="0" w:line="240" w:lineRule="auto"/>
+    </w:pPr>
+    <w:tblPr>
+      <w:tblBorders>
+        <w:top w:val="single" w:sz="4" w:space="0" w:color="auto"/>
+        <w:left w:val="single" w:sz="4" w:space="0" w:color="auto"/>
+        <w:bottom w:val="single" w:sz="4" w:space="0" w:color="auto"/>
+        <w:right w:val="single" w:sz="4" w:space="0" w:color="auto"/>
+        <w:insideH w:val="single" w:sz="4" w:space="0" w:color="auto"/>
+        <w:insideV w:val="single" w:sz="4" w:space="0" w:color="auto"/>
+      </w:tblBorders>
+    </w:tblPr>
+  </w:style>
+  <w:style w:type="table" w:styleId="LightShading">
+    <w:name w:val="Light Shading"/>
+    <w:basedOn w:val="TableNormal"/>
+    <w:uiPriority w:val="60"/>
+    <w:rsid w:val="00EF0D1A"/>
+    <w:pPr>
+      <w:spacing w:after="0" w:line="240" w:lineRule="auto"/>
+    </w:pPr>
+    <w:rPr>
+      <w:color w:val="000000" w:themeColor="text1" w:themeShade="BF"/>
+    </w:rPr>
+    <w:tblPr>
+      <w:tblStyleRowBandSize w:val="1"/>
+      <w:tblStyleColBandSize w:val="1"/>
+      <w:tblBorders>
+        <w:top w:val="single" w:sz="8" w:space="0" w:color="000000" w:themeColor="text1"/>
+        <w:bottom w:val="single" w:sz="8" w:space="0" w:color="000000" w:themeColor="text1"/>
+      </w:tblBorders>
+    </w:tblPr>
+    <w:tblStylePr w:type="firstRow">
+      <w:pPr>
+        <w:spacing w:before="0" w:after="0" w:line="240" w:lineRule="auto"/>
+      </w:pPr>
+      <w:rPr>
+        <w:b/>
+        <w:bCs/>
+      </w:rPr>
+      <w:tblPr/>
+      <w:tcPr>
+        <w:tcBorders>
+          <w:top w:val="single" w:sz="8" w:space="0" w:color="000000" w:themeColor="text1"/>
+          <w:left w:val="nil"/>
+          <w:bottom w:val="single" w:sz="8" w:space="0" w:color="000000" w:themeColor="text1"/>
+          <w:right w:val="nil"/>
+          <w:insideH w:val="nil"/>
+          <w:insideV w:val="nil"/>
+        </w:tcBorders>
+      </w:tcPr>
+    </w:tblStylePr>
+    <w:tblStylePr w:type="lastRow">
+      <w:pPr>
+        <w:spacing w:before="0" w:after="0" w:line="240" w:lineRule="auto"/>
+      </w:pPr>
+      <w:rPr>
+        <w:b/>
+        <w:bCs/>
+      </w:rPr>
+      <w:tblPr/>
+      <w:tcPr>
+        <w:tcBorders>
+          <w:top w:val="single" w:sz="8" w:space="0" w:color="000000" w:themeColor="text1"/>
+          <w:left w:val="nil"/>
+          <w:bottom w:val="single" w:sz="8" w:space="0" w:color="000000" w:themeColor="text1"/>
+          <w:right w:val="nil"/>
+          <w:insideH w:val="nil"/>
+          <w:insideV w:val="nil"/>
+        </w:tcBorders>
+      </w:tcPr>
+    </w:tblStylePr>
+    <w:tblStylePr w:type="firstCol">
+      <w:rPr>
+        <w:b/>
+        <w:bCs/>
+      </w:rPr>
+    </w:tblStylePr>
+    <w:tblStylePr w:type="lastCol">
+      <w:rPr>
+        <w:b/>
+        <w:bCs/>
+      </w:rPr>
+    </w:tblStylePr>
+    <w:tblStylePr w:type="band1Vert">
+      <w:tblPr/>
+      <w:tcPr>
+        <w:tcBorders>
+          <w:left w:val="nil"/>
+          <w:right w:val="nil"/>
+          <w:insideH w:val="nil"/>
+          <w:insideV w:val="nil"/>
+        </w:tcBorders>
+        <w:shd w:val="clear" w:color="auto" w:fill="C0C0C0" w:themeFill="text1" w:themeFillTint="3F"/>
+      </w:tcPr>
+    </w:tblStylePr>
+    <w:tblStylePr w:type="band1Horz">
+      <w:tblPr/>
+      <w:tcPr>
+        <w:tcBorders>
+          <w:left w:val="nil"/>
+          <w:right w:val="nil"/>
+          <w:insideH w:val="nil"/>
+          <w:insideV w:val="nil"/>
+        </w:tcBorders>
+        <w:shd w:val="clear" w:color="auto" w:fill="C0C0C0" w:themeFill="text1" w:themeFillTint="3F"/>
+      </w:tcPr>
+    </w:tblStylePr>
+  </w:style>
+  <w:style w:type="paragraph" w:styleId="BalloonText">
+    <w:name w:val="Balloon Text"/>
+    <w:basedOn w:val="Normal"/>
+    <w:link w:val="BalloonTextChar"/>
+    <w:uiPriority w:val="99"/>
+    <w:semiHidden/>
+    <w:unhideWhenUsed/>
+    <w:rsid w:val="0071788E"/>
+    <w:pPr>
+      <w:spacing w:after="0" w:line="240" w:lineRule="auto"/>
+    </w:pPr>
+    <w:rPr>
+      <w:rFonts w:ascii="Tahoma" w:hAnsi="Tahoma" w:cs="Tahoma"/>
+      <w:sz w:val="16"/>
+      <w:szCs w:val="16"/>
+    </w:rPr>
+  </w:style>
+  <w:style w:type="character" w:customStyle="1" w:styleId="BalloonTextChar">
+    <w:name w:val="Balloon Text Char"/>
+    <w:basedOn w:val="DefaultParagraphFont"/>
+    <w:link w:val="BalloonText"/>
+    <w:uiPriority w:val="99"/>
+    <w:semiHidden/>
+    <w:rsid w:val="0071788E"/>
+    <w:rPr>
+      <w:rFonts w:ascii="Tahoma" w:hAnsi="Tahoma" w:cs="Tahoma"/>
+      <w:sz w:val="16"/>
+      <w:szCs w:val="16"/>
     </w:rPr>
   </w:style>
 </w:styles>
@@ -2797,7 +5581,7 @@
 </file>
 
 <file path=customXml/itemProps1.xml><?xml version="1.0" encoding="utf-8"?>
-<ds:datastoreItem xmlns:ds="http://schemas.openxmlformats.org/officeDocument/2006/customXml" ds:itemID="{CCF1F8EF-F31F-4AA8-8802-DC7F3930740B}">
+<ds:datastoreItem xmlns:ds="http://schemas.openxmlformats.org/officeDocument/2006/customXml" ds:itemID="{52359BD4-D1B3-412B-B0DE-F2B68E841944}">
   <ds:schemaRefs>
     <ds:schemaRef ds:uri="http://schemas.openxmlformats.org/officeDocument/2006/bibliography"/>
   </ds:schemaRefs>

</xml_diff>